<commit_message>
Created Portal game and created portal mechanic.
</commit_message>
<xml_diff>
--- a/Week 2 ICT Fundamentals/Documents/ICT Security Fundamentals Workbook 2 - Online Presence and Privacy.docx
+++ b/Week 2 ICT Fundamentals/Documents/ICT Security Fundamentals Workbook 2 - Online Presence and Privacy.docx
@@ -394,7 +394,7 @@
               <w:szCs w:val="40"/>
             </w:rPr>
             <w:drawing>
-              <wp:anchor distT="0" distB="0" distL="114300" distR="114300" simplePos="0" relativeHeight="251670528" behindDoc="1" locked="0" layoutInCell="1" allowOverlap="1" wp14:anchorId="36A479DA" wp14:editId="39164A79">
+              <wp:anchor distT="0" distB="0" distL="114300" distR="114300" simplePos="0" relativeHeight="251670528" behindDoc="1" locked="0" layoutInCell="1" allowOverlap="1" wp14:anchorId="36A479DA" wp14:editId="1342074E">
                 <wp:simplePos x="0" y="0"/>
                 <wp:positionH relativeFrom="margin">
                   <wp:align>center</wp:align>
@@ -1964,7 +1964,21 @@
                 <w:rStyle w:val="Hyperlink"/>
                 <w:noProof/>
               </w:rPr>
-              <w:t>Declaration</w:t>
+              <w:t>Decl</w:t>
+            </w:r>
+            <w:r>
+              <w:rPr>
+                <w:rStyle w:val="Hyperlink"/>
+                <w:noProof/>
+              </w:rPr>
+              <w:t>a</w:t>
+            </w:r>
+            <w:r>
+              <w:rPr>
+                <w:rStyle w:val="Hyperlink"/>
+                <w:noProof/>
+              </w:rPr>
+              <w:t>ration</w:t>
             </w:r>
             <w:r>
               <w:rPr>
@@ -2168,7 +2182,19 @@
           <w:rPr>
             <w:rStyle w:val="Hyperlink"/>
           </w:rPr>
-          <w:t>https://www.esafety.gov.au/about-us/industry-regulation/social-media-age-restrictions/which-platforms-are-age-restricted</w:t>
+          <w:t>https://www.esafety.gov.au/about-us/industry-regulation/social-media-ag</w:t>
+        </w:r>
+        <w:r>
+          <w:rPr>
+            <w:rStyle w:val="Hyperlink"/>
+          </w:rPr>
+          <w:t>e</w:t>
+        </w:r>
+        <w:r>
+          <w:rPr>
+            <w:rStyle w:val="Hyperlink"/>
+          </w:rPr>
+          <w:t>-restrictions/which-platforms-are-age-restricted</w:t>
         </w:r>
       </w:hyperlink>
       <w:r>
@@ -2222,6 +2248,135 @@
       </w:r>
       <w:r>
         <w:t>lecture)</w:t>
+      </w:r>
+    </w:p>
+    <w:tbl>
+      <w:tblPr>
+        <w:tblStyle w:val="TableGrid"/>
+        <w:tblW w:w="0" w:type="auto"/>
+        <w:tblLook w:val="04A0" w:firstRow="1" w:lastRow="0" w:firstColumn="1" w:lastColumn="0" w:noHBand="0" w:noVBand="1"/>
+      </w:tblPr>
+      <w:tblGrid>
+        <w:gridCol w:w="9016"/>
+      </w:tblGrid>
+      <w:tr>
+        <w:tc>
+          <w:tcPr>
+            <w:tcW w:w="9016" w:type="dxa"/>
+          </w:tcPr>
+          <w:p>
+            <w:pPr>
+              <w:pStyle w:val="ListParagraph"/>
+              <w:numPr>
+                <w:ilvl w:val="0"/>
+                <w:numId w:val="3"/>
+              </w:numPr>
+            </w:pPr>
+            <w:r>
+              <w:t>Phishing Scams</w:t>
+            </w:r>
+          </w:p>
+          <w:p>
+            <w:pPr>
+              <w:pStyle w:val="ListParagraph"/>
+              <w:numPr>
+                <w:ilvl w:val="0"/>
+                <w:numId w:val="3"/>
+              </w:numPr>
+            </w:pPr>
+            <w:r>
+              <w:t>Data Spills/Leak</w:t>
+            </w:r>
+          </w:p>
+          <w:p>
+            <w:pPr>
+              <w:pStyle w:val="ListParagraph"/>
+              <w:numPr>
+                <w:ilvl w:val="0"/>
+                <w:numId w:val="3"/>
+              </w:numPr>
+            </w:pPr>
+            <w:r>
+              <w:t>Overexposure of PII (Self-Doxing)</w:t>
+            </w:r>
+          </w:p>
+          <w:p>
+            <w:pPr>
+              <w:pStyle w:val="ListParagraph"/>
+              <w:numPr>
+                <w:ilvl w:val="0"/>
+                <w:numId w:val="3"/>
+              </w:numPr>
+            </w:pPr>
+            <w:r>
+              <w:t>Weak or generic passwords</w:t>
+            </w:r>
+          </w:p>
+          <w:p>
+            <w:pPr>
+              <w:pStyle w:val="ListParagraph"/>
+              <w:numPr>
+                <w:ilvl w:val="0"/>
+                <w:numId w:val="3"/>
+              </w:numPr>
+            </w:pPr>
+            <w:r>
+              <w:t xml:space="preserve">Hacking </w:t>
+            </w:r>
+            <w:proofErr w:type="gramStart"/>
+            <w:r>
+              <w:t>( Trojan</w:t>
+            </w:r>
+            <w:proofErr w:type="gramEnd"/>
+            <w:r>
+              <w:t xml:space="preserve"> Horse, Virus, Malware)</w:t>
+            </w:r>
+          </w:p>
+          <w:p>
+            <w:pPr>
+              <w:pStyle w:val="ListParagraph"/>
+              <w:numPr>
+                <w:ilvl w:val="0"/>
+                <w:numId w:val="3"/>
+              </w:numPr>
+            </w:pPr>
+          </w:p>
+          <w:p/>
+          <w:p/>
+          <w:p/>
+          <w:p/>
+          <w:p/>
+        </w:tc>
+      </w:tr>
+    </w:tbl>
+    <w:p/>
+    <w:p>
+      <w:pPr>
+        <w:pStyle w:val="Heading2"/>
+      </w:pPr>
+      <w:bookmarkStart w:id="2" w:name="_Toc234248791"/>
+      <w:r>
+        <w:t>Question 2</w:t>
+      </w:r>
+      <w:r>
+        <w:t>:</w:t>
+      </w:r>
+      <w:r>
+        <w:t xml:space="preserve"> </w:t>
+      </w:r>
+      <w:r>
+        <w:t>Review Personal Social Media Use</w:t>
+      </w:r>
+      <w:bookmarkEnd w:id="2"/>
+    </w:p>
+    <w:p>
+      <w:r>
+        <w:t xml:space="preserve">Review your own social media presence. </w:t>
+      </w:r>
+    </w:p>
+    <w:p>
+      <w:r>
+        <w:t>What social media sites do you use (include any sites you have an account for, even if you are not active on those accounts)</w:t>
       </w:r>
     </w:p>
     <w:tbl>
@@ -2239,42 +2394,160 @@
             <w:tcW w:w="9016" w:type="dxa"/>
           </w:tcPr>
           <w:p/>
-          <w:p/>
-          <w:p/>
+          <w:p>
+            <w:pPr>
+              <w:pStyle w:val="ListParagraph"/>
+              <w:numPr>
+                <w:ilvl w:val="0"/>
+                <w:numId w:val="4"/>
+              </w:numPr>
+            </w:pPr>
+            <w:r>
+              <w:t>YouTube</w:t>
+            </w:r>
+          </w:p>
+          <w:p>
+            <w:pPr>
+              <w:pStyle w:val="ListParagraph"/>
+              <w:numPr>
+                <w:ilvl w:val="0"/>
+                <w:numId w:val="4"/>
+              </w:numPr>
+            </w:pPr>
+            <w:r>
+              <w:t>Reddit</w:t>
+            </w:r>
+          </w:p>
+          <w:p>
+            <w:pPr>
+              <w:pStyle w:val="ListParagraph"/>
+              <w:numPr>
+                <w:ilvl w:val="0"/>
+                <w:numId w:val="4"/>
+              </w:numPr>
+            </w:pPr>
+            <w:r>
+              <w:t>NetEase Games Account</w:t>
+            </w:r>
+          </w:p>
+          <w:p>
+            <w:pPr>
+              <w:ind w:left="360"/>
+            </w:pPr>
+          </w:p>
           <w:p/>
           <w:p/>
           <w:p/>
         </w:tc>
       </w:tr>
     </w:tbl>
-    <w:p/>
     <w:p>
-      <w:pPr>
-        <w:pStyle w:val="Heading2"/>
-      </w:pPr>
-      <w:bookmarkStart w:id="2" w:name="_Toc234248791"/>
-      <w:r>
-        <w:t>Question 2</w:t>
-      </w:r>
-      <w:r>
-        <w:t>:</w:t>
-      </w:r>
       <w:r>
         <w:t xml:space="preserve"> </w:t>
       </w:r>
-      <w:r>
-        <w:t>Review Personal Social Media Use</w:t>
-      </w:r>
-      <w:bookmarkEnd w:id="2"/>
     </w:p>
     <w:p>
-      <w:r>
-        <w:t xml:space="preserve">Review your own social media presence. </w:t>
+      <w:pPr>
+        <w:rPr>
+          <w:sz w:val="28"/>
+          <w:szCs w:val="28"/>
+          <w:u w:val="single"/>
+        </w:rPr>
+      </w:pPr>
+      <w:r>
+        <w:br w:type="page"/>
       </w:r>
     </w:p>
     <w:p>
-      <w:r>
-        <w:t>What social media sites do you use (include any sites you have an account for, even if you are not active on those accounts)</w:t>
+      <w:pPr>
+        <w:pStyle w:val="Heading2"/>
+      </w:pPr>
+      <w:bookmarkStart w:id="3" w:name="_Toc234248792"/>
+      <w:r>
+        <w:lastRenderedPageBreak/>
+        <w:t>Question 3</w:t>
+      </w:r>
+      <w:r>
+        <w:t>:</w:t>
+      </w:r>
+      <w:r>
+        <w:t xml:space="preserve"> Identify Your Personal Favourite Social Media Sites</w:t>
+      </w:r>
+      <w:bookmarkEnd w:id="3"/>
+      <w:r>
+        <w:t xml:space="preserve"> </w:t>
+      </w:r>
+    </w:p>
+    <w:p>
+      <w:pPr>
+        <w:pStyle w:val="AIEStandard"/>
+      </w:pPr>
+      <w:r>
+        <w:t xml:space="preserve">Select the two (2) sites you are most active on. For these sites, identify any personal information you may have shared. </w:t>
+      </w:r>
+    </w:p>
+    <w:p>
+      <w:pPr>
+        <w:pStyle w:val="AIEStandard"/>
+      </w:pPr>
+      <w:r>
+        <w:t xml:space="preserve">Don’t just consider information like your name and address. Have you shared your </w:t>
+      </w:r>
+      <w:proofErr w:type="gramStart"/>
+      <w:r>
+        <w:t>school</w:t>
+      </w:r>
+      <w:proofErr w:type="gramEnd"/>
+      <w:r>
+        <w:t xml:space="preserve"> name, pets name, sport team, type of family car, etc. – or pictures of any of these. While this information might not necessarily identify you, it could be used in a social engineering attack.</w:t>
+      </w:r>
+    </w:p>
+    <w:p>
+      <w:pPr>
+        <w:rPr>
+          <w:b/>
+          <w:bCs/>
+        </w:rPr>
+      </w:pPr>
+      <w:r>
+        <w:rPr>
+          <w:b/>
+          <w:bCs/>
+          <w:highlight w:val="yellow"/>
+        </w:rPr>
+        <w:t>DO NOT GIVE US THE DETAILED INFORMATION!!</w:t>
+      </w:r>
+    </w:p>
+    <w:p>
+      <w:pPr>
+        <w:pStyle w:val="AIEStandard"/>
+      </w:pPr>
+      <w:r>
+        <w:t xml:space="preserve">for example, if you have shared your pet’s name online, just put </w:t>
+      </w:r>
+      <w:r>
+        <w:rPr>
+          <w:i/>
+          <w:iCs/>
+        </w:rPr>
+        <w:t>‘pet’s name’</w:t>
+      </w:r>
+      <w:r>
+        <w:t xml:space="preserve"> </w:t>
+      </w:r>
+    </w:p>
+    <w:p>
+      <w:pPr>
+        <w:pStyle w:val="AIEStandard"/>
+      </w:pPr>
+      <w:r>
+        <w:t xml:space="preserve">If you have no social media </w:t>
+      </w:r>
+      <w:r>
+        <w:t>presence,</w:t>
+      </w:r>
+      <w:r>
+        <w:t xml:space="preserve"> just say ‘no social media presence’ </w:t>
       </w:r>
     </w:p>
     <w:tbl>
@@ -2292,6 +2565,43 @@
             <w:tcW w:w="9016" w:type="dxa"/>
           </w:tcPr>
           <w:p/>
+          <w:p>
+            <w:pPr>
+              <w:pStyle w:val="ListParagraph"/>
+              <w:numPr>
+                <w:ilvl w:val="0"/>
+                <w:numId w:val="5"/>
+              </w:numPr>
+            </w:pPr>
+            <w:r>
+              <w:t>YouTube: My name</w:t>
+            </w:r>
+          </w:p>
+          <w:p>
+            <w:pPr>
+              <w:pStyle w:val="ListParagraph"/>
+              <w:numPr>
+                <w:ilvl w:val="0"/>
+                <w:numId w:val="5"/>
+              </w:numPr>
+            </w:pPr>
+            <w:r>
+              <w:t>Marvel Rivals: Nothing</w:t>
+            </w:r>
+          </w:p>
+          <w:p>
+            <w:pPr>
+              <w:pStyle w:val="ListParagraph"/>
+              <w:numPr>
+                <w:ilvl w:val="0"/>
+                <w:numId w:val="5"/>
+              </w:numPr>
+            </w:pPr>
+            <w:r>
+              <w:t>No social media presence</w:t>
+            </w:r>
+          </w:p>
+          <w:p/>
           <w:p/>
           <w:p/>
           <w:p/>
@@ -2299,136 +2609,62 @@
         </w:tc>
       </w:tr>
     </w:tbl>
+    <w:p/>
     <w:p>
+      <w:pPr>
+        <w:pStyle w:val="Heading2"/>
+      </w:pPr>
+      <w:bookmarkStart w:id="4" w:name="_Toc234248793"/>
+      <w:r>
+        <w:t xml:space="preserve">Question </w:t>
+      </w:r>
+      <w:r>
+        <w:t>4</w:t>
+      </w:r>
+      <w:r>
+        <w:t>:</w:t>
+      </w:r>
       <w:r>
         <w:t xml:space="preserve"> </w:t>
       </w:r>
+      <w:r>
+        <w:t>Check If You Have Been Pwned</w:t>
+      </w:r>
+      <w:bookmarkEnd w:id="4"/>
     </w:p>
     <w:p>
-      <w:pPr>
-        <w:rPr>
-          <w:sz w:val="28"/>
-          <w:szCs w:val="28"/>
-          <w:u w:val="single"/>
-        </w:rPr>
-      </w:pPr>
-      <w:r>
-        <w:br w:type="page"/>
-      </w:r>
-    </w:p>
-    <w:p>
-      <w:pPr>
-        <w:pStyle w:val="Heading2"/>
-      </w:pPr>
-      <w:bookmarkStart w:id="3" w:name="_Toc234248792"/>
-      <w:r>
-        <w:lastRenderedPageBreak/>
-        <w:t>Question 3</w:t>
-      </w:r>
-      <w:r>
-        <w:t>:</w:t>
-      </w:r>
-      <w:r>
-        <w:t xml:space="preserve"> Identify Your Personal Favourite Social Media Sites</w:t>
-      </w:r>
-      <w:bookmarkEnd w:id="3"/>
-      <w:r>
-        <w:t xml:space="preserve"> </w:t>
-      </w:r>
-    </w:p>
-    <w:p>
-      <w:pPr>
-        <w:pStyle w:val="AIEStandard"/>
-      </w:pPr>
-      <w:r>
-        <w:t>Select the</w:t>
-      </w:r>
-      <w:r>
-        <w:t xml:space="preserve"> two</w:t>
-      </w:r>
-      <w:r>
-        <w:t xml:space="preserve"> </w:t>
-      </w:r>
-      <w:r>
-        <w:t>(</w:t>
-      </w:r>
-      <w:r>
-        <w:t>2</w:t>
-      </w:r>
-      <w:r>
-        <w:t>)</w:t>
-      </w:r>
-      <w:r>
-        <w:t xml:space="preserve"> sites you are most active on. For these sites, identify any personal information you may have shared. </w:t>
-      </w:r>
-    </w:p>
-    <w:p>
-      <w:pPr>
-        <w:pStyle w:val="AIEStandard"/>
-      </w:pPr>
-      <w:r>
-        <w:t xml:space="preserve">Don’t just consider information like your name and address. Have you shared your </w:t>
-      </w:r>
-      <w:proofErr w:type="gramStart"/>
-      <w:r>
-        <w:t>school</w:t>
-      </w:r>
-      <w:proofErr w:type="gramEnd"/>
-      <w:r>
-        <w:t xml:space="preserve"> name, pets name, sport team, type of family car, etc. – or pictures of any of these. While this information might not necessarily identify you, it could be used in a social engineering attack.</w:t>
-      </w:r>
-    </w:p>
-    <w:p>
-      <w:pPr>
-        <w:rPr>
-          <w:b/>
-          <w:bCs/>
-        </w:rPr>
-      </w:pPr>
-      <w:r>
-        <w:rPr>
-          <w:b/>
-          <w:bCs/>
-          <w:highlight w:val="yellow"/>
-        </w:rPr>
-        <w:t>DO NOT GIVE US THE DETAILED INFORMATION!!</w:t>
-      </w:r>
-    </w:p>
-    <w:p>
-      <w:pPr>
-        <w:pStyle w:val="AIEStandard"/>
-      </w:pPr>
-      <w:r>
-        <w:t xml:space="preserve">for example, if you have shared your pet’s name online, just put </w:t>
+      <w:r>
+        <w:t xml:space="preserve">Go to the website </w:t>
       </w:r>
       <w:r>
         <w:rPr>
           <w:i/>
           <w:iCs/>
         </w:rPr>
-        <w:t>‘pet’s name’</w:t>
+        <w:t>Have I Been Pwned?</w:t>
       </w:r>
       <w:r>
         <w:t xml:space="preserve"> </w:t>
+      </w:r>
+      <w:hyperlink r:id="rId14" w:history="1">
+        <w:r>
+          <w:rPr>
+            <w:rStyle w:val="Hyperlink"/>
+          </w:rPr>
+          <w:t>https://haveibeenpwned.com/</w:t>
+        </w:r>
+      </w:hyperlink>
+      <w:r>
+        <w:t xml:space="preserve"> </w:t>
+      </w:r>
+      <w:r>
+        <w:br/>
+        <w:t>Enter any email address you use to log into any of your online accounts.</w:t>
       </w:r>
     </w:p>
     <w:p>
-      <w:pPr>
-        <w:pStyle w:val="AIEStandard"/>
-      </w:pPr>
-      <w:r>
-        <w:t xml:space="preserve">If you have no social media </w:t>
-      </w:r>
-      <w:proofErr w:type="gramStart"/>
-      <w:r>
-        <w:t>presence</w:t>
-      </w:r>
-      <w:proofErr w:type="gramEnd"/>
-      <w:r>
-        <w:t xml:space="preserve"> just say ‘no social media presence’</w:t>
-      </w:r>
-      <w:r>
-        <w:t xml:space="preserve"> </w:t>
+      <w:r>
+        <w:t>List any data breaches found for any of your email addresses:</w:t>
       </w:r>
     </w:p>
     <w:tbl>
@@ -2446,7 +2682,17 @@
             <w:tcW w:w="9016" w:type="dxa"/>
           </w:tcPr>
           <w:p/>
-          <w:p/>
+          <w:p>
+            <w:r>
+              <w:t xml:space="preserve">No data </w:t>
+            </w:r>
+            <w:r>
+              <w:t>breaches</w:t>
+            </w:r>
+            <w:r>
+              <w:t>.</w:t>
+            </w:r>
+          </w:p>
           <w:p/>
           <w:p/>
           <w:p/>
@@ -2458,80 +2704,38 @@
     <w:p/>
     <w:p>
       <w:pPr>
-        <w:pStyle w:val="Heading2"/>
-      </w:pPr>
-      <w:bookmarkStart w:id="4" w:name="_Toc234248793"/>
-      <w:r>
-        <w:t xml:space="preserve">Question </w:t>
-      </w:r>
-      <w:r>
-        <w:t>4</w:t>
-      </w:r>
-      <w:r>
-        <w:t>:</w:t>
-      </w:r>
-      <w:r>
-        <w:t xml:space="preserve"> </w:t>
-      </w:r>
-      <w:r>
-        <w:t xml:space="preserve">Check If You Have Been </w:t>
-      </w:r>
-      <w:proofErr w:type="spellStart"/>
-      <w:r>
-        <w:t>Pwned</w:t>
-      </w:r>
-      <w:bookmarkEnd w:id="4"/>
-      <w:proofErr w:type="spellEnd"/>
+        <w:rPr>
+          <w:sz w:val="28"/>
+          <w:szCs w:val="28"/>
+          <w:u w:val="single"/>
+        </w:rPr>
+      </w:pPr>
+      <w:r>
+        <w:br w:type="page"/>
+      </w:r>
     </w:p>
     <w:p>
-      <w:r>
-        <w:t xml:space="preserve">Go to the website </w:t>
-      </w:r>
-      <w:r>
-        <w:rPr>
-          <w:i/>
-          <w:iCs/>
-        </w:rPr>
-        <w:t xml:space="preserve">Have I Been </w:t>
-      </w:r>
-      <w:proofErr w:type="spellStart"/>
-      <w:r>
-        <w:rPr>
-          <w:i/>
-          <w:iCs/>
-        </w:rPr>
-        <w:t>Pwned</w:t>
-      </w:r>
-      <w:proofErr w:type="spellEnd"/>
-      <w:r>
-        <w:rPr>
-          <w:i/>
-          <w:iCs/>
-        </w:rPr>
-        <w:t>?</w:t>
-      </w:r>
-      <w:r>
-        <w:t xml:space="preserve"> </w:t>
-      </w:r>
-      <w:hyperlink r:id="rId14" w:history="1">
-        <w:r>
-          <w:rPr>
-            <w:rStyle w:val="Hyperlink"/>
-          </w:rPr>
-          <w:t>https://haveibeenpwned.com/</w:t>
-        </w:r>
-      </w:hyperlink>
-      <w:r>
-        <w:t xml:space="preserve"> </w:t>
-      </w:r>
-      <w:r>
-        <w:br/>
-        <w:t>Enter any email address you use to log into any of your online accounts.</w:t>
-      </w:r>
+      <w:pPr>
+        <w:pStyle w:val="Heading2"/>
+      </w:pPr>
+      <w:bookmarkStart w:id="5" w:name="_Toc234248794"/>
+      <w:r>
+        <w:lastRenderedPageBreak/>
+        <w:t xml:space="preserve">Question 5: </w:t>
+      </w:r>
+      <w:r>
+        <w:t>Identify How Exposed You Are Online</w:t>
+      </w:r>
+      <w:bookmarkEnd w:id="5"/>
     </w:p>
     <w:p>
       <w:r>
-        <w:t>List any data breaches found for any of your email addresses:</w:t>
+        <w:t xml:space="preserve">Log out of all your social media accounts or open a private tab in your Internet browser (in Firefox press Ctrl + Shift + P, in Chrome press Ctrl + Shift + N). Perform an ego search. </w:t>
+      </w:r>
+    </w:p>
+    <w:p>
+      <w:r>
+        <w:t>What type of information appears about you? (For example, is there a photo of you, information about where you live, etc?)</w:t>
       </w:r>
     </w:p>
     <w:tbl>
@@ -2549,76 +2753,11 @@
             <w:tcW w:w="9016" w:type="dxa"/>
           </w:tcPr>
           <w:p/>
-          <w:p/>
-          <w:p/>
-          <w:p/>
-          <w:p/>
-          <w:p/>
-          <w:p/>
-        </w:tc>
-      </w:tr>
-    </w:tbl>
-    <w:p/>
-    <w:p>
-      <w:pPr>
-        <w:rPr>
-          <w:sz w:val="28"/>
-          <w:szCs w:val="28"/>
-          <w:u w:val="single"/>
-        </w:rPr>
-      </w:pPr>
-      <w:r>
-        <w:br w:type="page"/>
-      </w:r>
-    </w:p>
-    <w:p>
-      <w:pPr>
-        <w:pStyle w:val="Heading2"/>
-      </w:pPr>
-      <w:bookmarkStart w:id="5" w:name="_Toc234248794"/>
-      <w:r>
-        <w:lastRenderedPageBreak/>
-        <w:t xml:space="preserve">Question 5: </w:t>
-      </w:r>
-      <w:r>
-        <w:t>Identify How Exposed You Are Online</w:t>
-      </w:r>
-      <w:bookmarkEnd w:id="5"/>
-    </w:p>
-    <w:p>
-      <w:r>
-        <w:t xml:space="preserve">Log out of all your social media accounts or open a private tab in your Internet browser (in Firefox press Ctrl + Shift + P, in Chrome press Ctrl + Shift + N). Perform an ego search. </w:t>
-      </w:r>
-    </w:p>
-    <w:p>
-      <w:r>
-        <w:t xml:space="preserve">What type of information appears </w:t>
-      </w:r>
-      <w:proofErr w:type="gramStart"/>
-      <w:r>
-        <w:t>about</w:t>
-      </w:r>
-      <w:proofErr w:type="gramEnd"/>
-      <w:r>
-        <w:t xml:space="preserve"> you? (For example, is there a photo of you, information about where you live, etc?)</w:t>
-      </w:r>
-    </w:p>
-    <w:tbl>
-      <w:tblPr>
-        <w:tblStyle w:val="TableGrid"/>
-        <w:tblW w:w="0" w:type="auto"/>
-        <w:tblLook w:val="04A0" w:firstRow="1" w:lastRow="0" w:firstColumn="1" w:lastColumn="0" w:noHBand="0" w:noVBand="1"/>
-      </w:tblPr>
-      <w:tblGrid>
-        <w:gridCol w:w="9016"/>
-      </w:tblGrid>
-      <w:tr>
-        <w:tc>
-          <w:tcPr>
-            <w:tcW w:w="9016" w:type="dxa"/>
-          </w:tcPr>
-          <w:p/>
-          <w:p/>
+          <w:p>
+            <w:r>
+              <w:t>My reddit account is found by searching my gamertag.</w:t>
+            </w:r>
+          </w:p>
           <w:p/>
           <w:p/>
           <w:p/>
@@ -2752,6 +2891,160 @@
             </w:r>
             <w:r>
               <w:t>)</w:t>
+            </w:r>
+          </w:p>
+        </w:tc>
+        <w:tc>
+          <w:tcPr>
+            <w:tcW w:w="1134" w:type="dxa"/>
+          </w:tcPr>
+          <w:p/>
+        </w:tc>
+        <w:tc>
+          <w:tcPr>
+            <w:tcW w:w="1418" w:type="dxa"/>
+          </w:tcPr>
+          <w:p/>
+        </w:tc>
+        <w:tc>
+          <w:tcPr>
+            <w:tcW w:w="1275" w:type="dxa"/>
+          </w:tcPr>
+          <w:p>
+            <w:pPr>
+              <w:rPr>
+                <w:sz w:val="72"/>
+                <w:szCs w:val="72"/>
+              </w:rPr>
+            </w:pPr>
+            <w:r>
+              <w:rPr>
+                <w:sz w:val="72"/>
+                <w:szCs w:val="72"/>
+              </w:rPr>
+              <w:t>X</w:t>
+            </w:r>
+          </w:p>
+        </w:tc>
+        <w:tc>
+          <w:tcPr>
+            <w:tcW w:w="1650" w:type="dxa"/>
+          </w:tcPr>
+          <w:p/>
+        </w:tc>
+      </w:tr>
+      <w:tr>
+        <w:tc>
+          <w:tcPr>
+            <w:tcW w:w="3539" w:type="dxa"/>
+          </w:tcPr>
+          <w:p>
+            <w:r>
+              <w:t>It would be easy for someone to hack my accounts</w:t>
+            </w:r>
+          </w:p>
+          <w:p>
+            <w:r>
+              <w:t>(My email has been disclosed in one or more data breaches and I reuse passwords)</w:t>
+            </w:r>
+          </w:p>
+        </w:tc>
+        <w:tc>
+          <w:tcPr>
+            <w:tcW w:w="1134" w:type="dxa"/>
+          </w:tcPr>
+          <w:p/>
+        </w:tc>
+        <w:tc>
+          <w:tcPr>
+            <w:tcW w:w="1418" w:type="dxa"/>
+          </w:tcPr>
+          <w:p/>
+        </w:tc>
+        <w:tc>
+          <w:tcPr>
+            <w:tcW w:w="1275" w:type="dxa"/>
+          </w:tcPr>
+          <w:p>
+            <w:r>
+              <w:t>X</w:t>
+            </w:r>
+          </w:p>
+        </w:tc>
+        <w:tc>
+          <w:tcPr>
+            <w:tcW w:w="1650" w:type="dxa"/>
+          </w:tcPr>
+          <w:p/>
+        </w:tc>
+      </w:tr>
+      <w:tr>
+        <w:tc>
+          <w:tcPr>
+            <w:tcW w:w="3539" w:type="dxa"/>
+          </w:tcPr>
+          <w:p>
+            <w:r>
+              <w:t>Someone could guess my password</w:t>
+            </w:r>
+          </w:p>
+          <w:p>
+            <w:r>
+              <w:t>(My password is based on personal information – like a pet’s name – which is easily discoverable)</w:t>
+            </w:r>
+          </w:p>
+        </w:tc>
+        <w:tc>
+          <w:tcPr>
+            <w:tcW w:w="1134" w:type="dxa"/>
+          </w:tcPr>
+          <w:p/>
+        </w:tc>
+        <w:tc>
+          <w:tcPr>
+            <w:tcW w:w="1418" w:type="dxa"/>
+          </w:tcPr>
+          <w:p/>
+        </w:tc>
+        <w:tc>
+          <w:tcPr>
+            <w:tcW w:w="1275" w:type="dxa"/>
+          </w:tcPr>
+          <w:p>
+            <w:r>
+              <w:t>X</w:t>
+            </w:r>
+          </w:p>
+        </w:tc>
+        <w:tc>
+          <w:tcPr>
+            <w:tcW w:w="1650" w:type="dxa"/>
+          </w:tcPr>
+          <w:p/>
+        </w:tc>
+      </w:tr>
+      <w:tr>
+        <w:tc>
+          <w:tcPr>
+            <w:tcW w:w="3539" w:type="dxa"/>
+          </w:tcPr>
+          <w:p>
+            <w:r>
+              <w:t>Someone could phish/social engineer me</w:t>
+            </w:r>
+          </w:p>
+          <w:p>
+            <w:r>
+              <w:t xml:space="preserve">(Information about where I work or who </w:t>
+            </w:r>
+            <w:r>
+              <w:rPr>
+                <w:iCs/>
+              </w:rPr>
+              <w:t xml:space="preserve">I </w:t>
+            </w:r>
+            <w:r>
+              <w:t>bank with, etc is discoverable and could be used in a social engineering attack)</w:t>
             </w:r>
           </w:p>
         </w:tc>
@@ -2777,7 +3070,11 @@
           <w:tcPr>
             <w:tcW w:w="1650" w:type="dxa"/>
           </w:tcPr>
-          <w:p/>
+          <w:p>
+            <w:r>
+              <w:t>X</w:t>
+            </w:r>
+          </w:p>
         </w:tc>
       </w:tr>
       <w:tr>
@@ -2787,12 +3084,12 @@
           </w:tcPr>
           <w:p>
             <w:r>
-              <w:t>It would be easy for someone to hack my accounts</w:t>
-            </w:r>
-          </w:p>
-          <w:p>
-            <w:r>
-              <w:t>(My email has been disclosed in one or more data breaches and I reuse passwords)</w:t>
+              <w:t>Information about me online does not reflect the image I want to present</w:t>
+            </w:r>
+          </w:p>
+          <w:p>
+            <w:r>
+              <w:t>(Could a future employer consider not hiring you based on information they might discover about you online?)</w:t>
             </w:r>
           </w:p>
         </w:tc>
@@ -2812,139 +3109,11 @@
           <w:tcPr>
             <w:tcW w:w="1275" w:type="dxa"/>
           </w:tcPr>
-          <w:p/>
-        </w:tc>
-        <w:tc>
-          <w:tcPr>
-            <w:tcW w:w="1650" w:type="dxa"/>
-          </w:tcPr>
-          <w:p/>
-        </w:tc>
-      </w:tr>
-      <w:tr>
-        <w:tc>
-          <w:tcPr>
-            <w:tcW w:w="3539" w:type="dxa"/>
-          </w:tcPr>
-          <w:p>
-            <w:r>
-              <w:t>Someone could guess my password</w:t>
-            </w:r>
-          </w:p>
-          <w:p>
-            <w:r>
-              <w:t>(My password is based on personal information – like a pet’s name – which is easily discoverable)</w:t>
-            </w:r>
-          </w:p>
-        </w:tc>
-        <w:tc>
-          <w:tcPr>
-            <w:tcW w:w="1134" w:type="dxa"/>
-          </w:tcPr>
-          <w:p/>
-        </w:tc>
-        <w:tc>
-          <w:tcPr>
-            <w:tcW w:w="1418" w:type="dxa"/>
-          </w:tcPr>
-          <w:p/>
-        </w:tc>
-        <w:tc>
-          <w:tcPr>
-            <w:tcW w:w="1275" w:type="dxa"/>
-          </w:tcPr>
-          <w:p/>
-        </w:tc>
-        <w:tc>
-          <w:tcPr>
-            <w:tcW w:w="1650" w:type="dxa"/>
-          </w:tcPr>
-          <w:p/>
-        </w:tc>
-      </w:tr>
-      <w:tr>
-        <w:tc>
-          <w:tcPr>
-            <w:tcW w:w="3539" w:type="dxa"/>
-          </w:tcPr>
-          <w:p>
-            <w:r>
-              <w:t>Someone could phish/social engineer me</w:t>
-            </w:r>
-          </w:p>
-          <w:p>
-            <w:r>
-              <w:t xml:space="preserve">(Information about where I work or who </w:t>
-            </w:r>
-            <w:r>
-              <w:rPr>
-                <w:iCs/>
-              </w:rPr>
-              <w:t xml:space="preserve">I </w:t>
-            </w:r>
-            <w:r>
-              <w:t>bank with, etc is discoverable and could be used in a social engineering attack)</w:t>
-            </w:r>
-          </w:p>
-        </w:tc>
-        <w:tc>
-          <w:tcPr>
-            <w:tcW w:w="1134" w:type="dxa"/>
-          </w:tcPr>
-          <w:p/>
-        </w:tc>
-        <w:tc>
-          <w:tcPr>
-            <w:tcW w:w="1418" w:type="dxa"/>
-          </w:tcPr>
-          <w:p/>
-        </w:tc>
-        <w:tc>
-          <w:tcPr>
-            <w:tcW w:w="1275" w:type="dxa"/>
-          </w:tcPr>
-          <w:p/>
-        </w:tc>
-        <w:tc>
-          <w:tcPr>
-            <w:tcW w:w="1650" w:type="dxa"/>
-          </w:tcPr>
-          <w:p/>
-        </w:tc>
-      </w:tr>
-      <w:tr>
-        <w:tc>
-          <w:tcPr>
-            <w:tcW w:w="3539" w:type="dxa"/>
-          </w:tcPr>
-          <w:p>
-            <w:r>
-              <w:t>Information about me online does not reflect the image I want to present</w:t>
-            </w:r>
-          </w:p>
-          <w:p>
-            <w:r>
-              <w:t>(Could a future employer consider not hiring you based on information they might discover about you online?)</w:t>
-            </w:r>
-          </w:p>
-        </w:tc>
-        <w:tc>
-          <w:tcPr>
-            <w:tcW w:w="1134" w:type="dxa"/>
-          </w:tcPr>
-          <w:p/>
-        </w:tc>
-        <w:tc>
-          <w:tcPr>
-            <w:tcW w:w="1418" w:type="dxa"/>
-          </w:tcPr>
-          <w:p/>
-        </w:tc>
-        <w:tc>
-          <w:tcPr>
-            <w:tcW w:w="1275" w:type="dxa"/>
-          </w:tcPr>
-          <w:p/>
+          <w:p>
+            <w:r>
+              <w:t>X</w:t>
+            </w:r>
+          </w:p>
         </w:tc>
         <w:tc>
           <w:tcPr>
@@ -3179,6 +3348,9 @@
             <w:pPr>
               <w:spacing w:after="200" w:line="276" w:lineRule="auto"/>
             </w:pPr>
+            <w:r>
+              <w:t>YouTube</w:t>
+            </w:r>
           </w:p>
         </w:tc>
         <w:tc>
@@ -3195,6 +3367,9 @@
             <w:pPr>
               <w:spacing w:after="200" w:line="276" w:lineRule="auto"/>
             </w:pPr>
+            <w:r>
+              <w:t>Privacy Settings</w:t>
+            </w:r>
           </w:p>
         </w:tc>
       </w:tr>
@@ -3213,6 +3388,9 @@
             <w:pPr>
               <w:spacing w:after="200" w:line="276" w:lineRule="auto"/>
             </w:pPr>
+            <w:r>
+              <w:t>Reddit</w:t>
+            </w:r>
           </w:p>
         </w:tc>
         <w:tc>
@@ -3229,6 +3407,9 @@
             <w:pPr>
               <w:spacing w:after="200" w:line="276" w:lineRule="auto"/>
             </w:pPr>
+            <w:r>
+              <w:t>Privacy Settings</w:t>
+            </w:r>
           </w:p>
         </w:tc>
       </w:tr>
@@ -3247,6 +3428,9 @@
             <w:pPr>
               <w:spacing w:after="200" w:line="276" w:lineRule="auto"/>
             </w:pPr>
+            <w:r>
+              <w:t>NetEase Games</w:t>
+            </w:r>
           </w:p>
         </w:tc>
         <w:tc>
@@ -3263,6 +3447,9 @@
             <w:pPr>
               <w:spacing w:after="200" w:line="276" w:lineRule="auto"/>
             </w:pPr>
+            <w:r>
+              <w:t>Privacy settings</w:t>
+            </w:r>
           </w:p>
         </w:tc>
       </w:tr>
@@ -3411,6 +3598,9 @@
             <w:pPr>
               <w:spacing w:after="200" w:line="276" w:lineRule="auto"/>
             </w:pPr>
+            <w:r>
+              <w:t>YouTube</w:t>
+            </w:r>
           </w:p>
         </w:tc>
         <w:tc>
@@ -3427,6 +3617,9 @@
             <w:pPr>
               <w:spacing w:after="200" w:line="276" w:lineRule="auto"/>
             </w:pPr>
+            <w:r>
+              <w:t>I sign in with Google</w:t>
+            </w:r>
           </w:p>
         </w:tc>
         <w:tc>
@@ -3443,6 +3636,9 @@
             <w:pPr>
               <w:spacing w:after="200" w:line="276" w:lineRule="auto"/>
             </w:pPr>
+            <w:r>
+              <w:t>Yes</w:t>
+            </w:r>
           </w:p>
         </w:tc>
         <w:tc>
@@ -3459,6 +3655,9 @@
             <w:pPr>
               <w:spacing w:after="200" w:line="276" w:lineRule="auto"/>
             </w:pPr>
+            <w:r>
+              <w:t>Yes</w:t>
+            </w:r>
           </w:p>
         </w:tc>
       </w:tr>
@@ -3477,6 +3676,9 @@
             <w:pPr>
               <w:spacing w:after="200" w:line="276" w:lineRule="auto"/>
             </w:pPr>
+            <w:r>
+              <w:t>Reddit</w:t>
+            </w:r>
           </w:p>
         </w:tc>
         <w:tc>
@@ -3493,6 +3695,9 @@
             <w:pPr>
               <w:spacing w:after="200" w:line="276" w:lineRule="auto"/>
             </w:pPr>
+            <w:r>
+              <w:t>Yes</w:t>
+            </w:r>
           </w:p>
         </w:tc>
         <w:tc>
@@ -3509,6 +3714,9 @@
             <w:pPr>
               <w:spacing w:after="200" w:line="276" w:lineRule="auto"/>
             </w:pPr>
+            <w:r>
+              <w:t>Yes</w:t>
+            </w:r>
           </w:p>
         </w:tc>
         <w:tc>
@@ -3525,6 +3733,9 @@
             <w:pPr>
               <w:spacing w:after="200" w:line="276" w:lineRule="auto"/>
             </w:pPr>
+            <w:r>
+              <w:t>Yes</w:t>
+            </w:r>
           </w:p>
         </w:tc>
       </w:tr>
@@ -3543,6 +3754,9 @@
             <w:pPr>
               <w:spacing w:after="200" w:line="276" w:lineRule="auto"/>
             </w:pPr>
+            <w:r>
+              <w:t>NetEase Games</w:t>
+            </w:r>
           </w:p>
         </w:tc>
         <w:tc>
@@ -3559,6 +3773,9 @@
             <w:pPr>
               <w:spacing w:after="200" w:line="276" w:lineRule="auto"/>
             </w:pPr>
+            <w:r>
+              <w:t>No password is used.</w:t>
+            </w:r>
           </w:p>
         </w:tc>
         <w:tc>
@@ -3575,6 +3792,9 @@
             <w:pPr>
               <w:spacing w:after="200" w:line="276" w:lineRule="auto"/>
             </w:pPr>
+            <w:r>
+              <w:t>No</w:t>
+            </w:r>
           </w:p>
         </w:tc>
         <w:tc>
@@ -3591,6 +3811,9 @@
             <w:pPr>
               <w:spacing w:after="200" w:line="276" w:lineRule="auto"/>
             </w:pPr>
+            <w:r>
+              <w:t>No</w:t>
+            </w:r>
           </w:p>
         </w:tc>
       </w:tr>
@@ -3710,6 +3933,30 @@
               <w:spacing w:after="200" w:line="276" w:lineRule="auto"/>
             </w:pPr>
           </w:p>
+          <w:p>
+            <w:pPr>
+              <w:pStyle w:val="ListParagraph"/>
+              <w:numPr>
+                <w:ilvl w:val="0"/>
+                <w:numId w:val="6"/>
+              </w:numPr>
+            </w:pPr>
+            <w:r>
+              <w:t>AVG Antivirus Free</w:t>
+            </w:r>
+          </w:p>
+          <w:p>
+            <w:pPr>
+              <w:pStyle w:val="ListParagraph"/>
+              <w:numPr>
+                <w:ilvl w:val="0"/>
+                <w:numId w:val="6"/>
+              </w:numPr>
+            </w:pPr>
+            <w:r>
+              <w:t>uBlock Origin</w:t>
+            </w:r>
+          </w:p>
         </w:tc>
       </w:tr>
       <w:tr>
@@ -3784,8 +4031,30 @@
           </w:tcPr>
           <w:p>
             <w:pPr>
-              <w:spacing w:after="200" w:line="276" w:lineRule="auto"/>
+              <w:pStyle w:val="ListParagraph"/>
+              <w:numPr>
+                <w:ilvl w:val="0"/>
+                <w:numId w:val="7"/>
+              </w:numPr>
             </w:pPr>
+            <w:r>
+              <w:t>Home PC: Up to date</w:t>
+            </w:r>
+          </w:p>
+          <w:p>
+            <w:pPr>
+              <w:pStyle w:val="ListParagraph"/>
+              <w:numPr>
+                <w:ilvl w:val="0"/>
+                <w:numId w:val="7"/>
+              </w:numPr>
+            </w:pPr>
+            <w:r>
+              <w:t xml:space="preserve">Samsung </w:t>
+            </w:r>
+            <w:r>
+              <w:t>Phone: Up to date</w:t>
+            </w:r>
           </w:p>
         </w:tc>
       </w:tr>
@@ -3863,7 +4132,55 @@
           </w:tcPr>
           <w:p>
             <w:pPr>
-              <w:spacing w:after="200" w:line="276" w:lineRule="auto"/>
+              <w:pStyle w:val="ListParagraph"/>
+              <w:numPr>
+                <w:ilvl w:val="0"/>
+                <w:numId w:val="9"/>
+              </w:numPr>
+            </w:pPr>
+            <w:r>
+              <w:t>PC: Secure Password</w:t>
+            </w:r>
+          </w:p>
+          <w:p>
+            <w:pPr>
+              <w:pStyle w:val="ListParagraph"/>
+              <w:numPr>
+                <w:ilvl w:val="0"/>
+                <w:numId w:val="9"/>
+              </w:numPr>
+            </w:pPr>
+            <w:r>
+              <w:t>Phone: Secure Password</w:t>
+            </w:r>
+          </w:p>
+          <w:p>
+            <w:pPr>
+              <w:pStyle w:val="ListParagraph"/>
+              <w:numPr>
+                <w:ilvl w:val="0"/>
+                <w:numId w:val="9"/>
+              </w:numPr>
+            </w:pPr>
+            <w:r>
+              <w:t>Router: Secure Password</w:t>
+            </w:r>
+          </w:p>
+          <w:p>
+            <w:pPr>
+              <w:pStyle w:val="ListParagraph"/>
+              <w:numPr>
+                <w:ilvl w:val="0"/>
+                <w:numId w:val="9"/>
+              </w:numPr>
+            </w:pPr>
+            <w:r>
+              <w:t>Security Cameras: Secure Password</w:t>
+            </w:r>
+          </w:p>
+          <w:p>
+            <w:pPr>
+              <w:pStyle w:val="ListParagraph"/>
             </w:pPr>
           </w:p>
         </w:tc>
@@ -3993,6 +4310,9 @@
             <w:pPr>
               <w:spacing w:after="200" w:line="276" w:lineRule="auto"/>
             </w:pPr>
+            <w:r>
+              <w:t>Reddit</w:t>
+            </w:r>
           </w:p>
         </w:tc>
         <w:tc>
@@ -4009,6 +4329,9 @@
             <w:pPr>
               <w:spacing w:after="200" w:line="276" w:lineRule="auto"/>
             </w:pPr>
+            <w:r>
+              <w:t>Unused I can delete.</w:t>
+            </w:r>
           </w:p>
         </w:tc>
       </w:tr>
@@ -4197,7 +4520,59 @@
             <w:tcW w:w="9016" w:type="dxa"/>
           </w:tcPr>
           <w:p/>
-          <w:p/>
+          <w:p>
+            <w:r>
+              <w:t xml:space="preserve">To secure my online presence, </w:t>
+            </w:r>
+            <w:r>
+              <w:t xml:space="preserve">I would make changes to my online presence on YouTube and Reddit. Currently on YouTube </w:t>
+            </w:r>
+            <w:r>
+              <w:t>my account displays my full name as my username. This makes it very easy for my information to be leaked. To fix this I have changed my username to my online secure username</w:t>
+            </w:r>
+            <w:r>
+              <w:t xml:space="preserve"> to minimise this risk. </w:t>
+            </w:r>
+            <w:r>
+              <w:t xml:space="preserve"> Additionally, my Reddit account is found when searching my online username. I do not use this account anymore therefore this data needs to be removed as it has some of </w:t>
+            </w:r>
+            <w:r>
+              <w:t xml:space="preserve">my </w:t>
+            </w:r>
+            <w:r>
+              <w:t>interests displayed on it.  To rectify this, I will delete this account to ensure my data stays secure</w:t>
+            </w:r>
+            <w:r>
+              <w:t xml:space="preserve"> and this information is not used against me. </w:t>
+            </w:r>
+            <w:r>
+              <w:t>I have a limited online presence as Reddit was my only form of social media, however, did not disclose any PII. All my personal devices are secure however perhaps a better Antivirus would be better</w:t>
+            </w:r>
+            <w:r>
+              <w:t xml:space="preserve"> or a VPN to secure my browsing online.</w:t>
+            </w:r>
+            <w:r>
+              <w:t xml:space="preserve"> </w:t>
+            </w:r>
+            <w:r>
+              <w:t>My password</w:t>
+            </w:r>
+            <w:r>
+              <w:t xml:space="preserve">s are </w:t>
+            </w:r>
+            <w:r>
+              <w:t>all secure and managed</w:t>
+            </w:r>
+            <w:r>
+              <w:t xml:space="preserve"> for all my online and offline accounts to ensure my data protection.</w:t>
+            </w:r>
+            <w:r>
+              <w:t xml:space="preserve"> </w:t>
+            </w:r>
+            <w:r>
+              <w:t xml:space="preserve">Therefore, my online presence and personal mobile and computing devices are secure. </w:t>
+            </w:r>
+          </w:p>
           <w:p/>
           <w:p/>
           <w:p/>
@@ -4220,7 +4595,6 @@
           <w:noProof/>
           <w:lang w:val="en-GB" w:eastAsia="ja-JP"/>
         </w:rPr>
-        <w:lastRenderedPageBreak/>
         <mc:AlternateContent>
           <mc:Choice Requires="wps">
             <w:drawing>
@@ -4382,6 +4756,17 @@
             <w:pPr>
               <w:pStyle w:val="AIEStandard"/>
             </w:pPr>
+            <w:r>
+              <w:t>GitHub</w:t>
+            </w:r>
+            <w:r>
+              <w:t xml:space="preserve">, </w:t>
+            </w:r>
+            <w:proofErr w:type="spellStart"/>
+            <w:r>
+              <w:t>Onedrive</w:t>
+            </w:r>
+            <w:proofErr w:type="spellEnd"/>
           </w:p>
         </w:tc>
       </w:tr>
@@ -4415,6 +4800,31 @@
           <w:p>
             <w:pPr>
               <w:pStyle w:val="AIEStandard"/>
+              <w:numPr>
+                <w:ilvl w:val="0"/>
+                <w:numId w:val="8"/>
+              </w:numPr>
+            </w:pPr>
+            <w:r>
+              <w:t>2FA</w:t>
+            </w:r>
+          </w:p>
+          <w:p>
+            <w:pPr>
+              <w:pStyle w:val="AIEStandard"/>
+              <w:numPr>
+                <w:ilvl w:val="0"/>
+                <w:numId w:val="8"/>
+              </w:numPr>
+            </w:pPr>
+            <w:r>
+              <w:t>Multifactor authentication</w:t>
+            </w:r>
+          </w:p>
+          <w:p>
+            <w:pPr>
+              <w:pStyle w:val="AIEStandard"/>
+              <w:ind w:left="720"/>
             </w:pPr>
           </w:p>
           <w:p>
@@ -4495,6 +4905,99 @@
             <w:pPr>
               <w:pStyle w:val="AIEStandard"/>
             </w:pPr>
+            <w:r>
+              <w:rPr>
+                <w:noProof/>
+              </w:rPr>
+              <w:lastRenderedPageBreak/>
+              <w:drawing>
+                <wp:inline distT="0" distB="0" distL="0" distR="0" wp14:anchorId="1E59E972" wp14:editId="279F86A4">
+                  <wp:extent cx="5731510" cy="4048760"/>
+                  <wp:effectExtent l="0" t="0" r="2540" b="8890"/>
+                  <wp:docPr id="217921068" name="Picture 5"/>
+                  <wp:cNvGraphicFramePr>
+                    <a:graphicFrameLocks xmlns:a="http://schemas.openxmlformats.org/drawingml/2006/main" noChangeAspect="1"/>
+                  </wp:cNvGraphicFramePr>
+                  <a:graphic xmlns:a="http://schemas.openxmlformats.org/drawingml/2006/main">
+                    <a:graphicData uri="http://schemas.openxmlformats.org/drawingml/2006/picture">
+                      <pic:pic xmlns:pic="http://schemas.openxmlformats.org/drawingml/2006/picture">
+                        <pic:nvPicPr>
+                          <pic:cNvPr id="217921068" name="Picture 217921068"/>
+                          <pic:cNvPicPr/>
+                        </pic:nvPicPr>
+                        <pic:blipFill>
+                          <a:blip r:embed="rId17">
+                            <a:extLst>
+                              <a:ext uri="{28A0092B-C50C-407E-A947-70E740481C1C}">
+                                <a14:useLocalDpi xmlns:a14="http://schemas.microsoft.com/office/drawing/2010/main" val="0"/>
+                              </a:ext>
+                            </a:extLst>
+                          </a:blip>
+                          <a:stretch>
+                            <a:fillRect/>
+                          </a:stretch>
+                        </pic:blipFill>
+                        <pic:spPr>
+                          <a:xfrm>
+                            <a:off x="0" y="0"/>
+                            <a:ext cx="5731510" cy="4048760"/>
+                          </a:xfrm>
+                          <a:prstGeom prst="rect">
+                            <a:avLst/>
+                          </a:prstGeom>
+                        </pic:spPr>
+                      </pic:pic>
+                    </a:graphicData>
+                  </a:graphic>
+                </wp:inline>
+              </w:drawing>
+            </w:r>
+            <w:r>
+              <w:rPr>
+                <w:noProof/>
+              </w:rPr>
+              <w:drawing>
+                <wp:inline distT="0" distB="0" distL="0" distR="0" wp14:anchorId="5F5C147C" wp14:editId="29F5682F">
+                  <wp:extent cx="5731510" cy="3100705"/>
+                  <wp:effectExtent l="0" t="0" r="2540" b="4445"/>
+                  <wp:docPr id="103035482" name="Picture 6"/>
+                  <wp:cNvGraphicFramePr>
+                    <a:graphicFrameLocks xmlns:a="http://schemas.openxmlformats.org/drawingml/2006/main" noChangeAspect="1"/>
+                  </wp:cNvGraphicFramePr>
+                  <a:graphic xmlns:a="http://schemas.openxmlformats.org/drawingml/2006/main">
+                    <a:graphicData uri="http://schemas.openxmlformats.org/drawingml/2006/picture">
+                      <pic:pic xmlns:pic="http://schemas.openxmlformats.org/drawingml/2006/picture">
+                        <pic:nvPicPr>
+                          <pic:cNvPr id="103035482" name="Picture 103035482"/>
+                          <pic:cNvPicPr/>
+                        </pic:nvPicPr>
+                        <pic:blipFill>
+                          <a:blip r:embed="rId18" cstate="print">
+                            <a:extLst>
+                              <a:ext uri="{28A0092B-C50C-407E-A947-70E740481C1C}">
+                                <a14:useLocalDpi xmlns:a14="http://schemas.microsoft.com/office/drawing/2010/main" val="0"/>
+                              </a:ext>
+                            </a:extLst>
+                          </a:blip>
+                          <a:stretch>
+                            <a:fillRect/>
+                          </a:stretch>
+                        </pic:blipFill>
+                        <pic:spPr>
+                          <a:xfrm>
+                            <a:off x="0" y="0"/>
+                            <a:ext cx="5731510" cy="3100705"/>
+                          </a:xfrm>
+                          <a:prstGeom prst="rect">
+                            <a:avLst/>
+                          </a:prstGeom>
+                        </pic:spPr>
+                      </pic:pic>
+                    </a:graphicData>
+                  </a:graphic>
+                </wp:inline>
+              </w:drawing>
+            </w:r>
           </w:p>
           <w:p>
             <w:pPr>
@@ -4529,6 +5032,7 @@
         </w:rPr>
       </w:pPr>
       <w:r>
+        <w:lastRenderedPageBreak/>
         <w:br w:type="page"/>
       </w:r>
     </w:p>
@@ -4539,22 +5043,7 @@
       <w:bookmarkStart w:id="15" w:name="_Toc234248804"/>
       <w:r>
         <w:lastRenderedPageBreak/>
-        <w:t xml:space="preserve">Task </w:t>
-      </w:r>
-      <w:r>
-        <w:t>2</w:t>
-      </w:r>
-      <w:r>
-        <w:t xml:space="preserve"> </w:t>
-      </w:r>
-      <w:r>
-        <w:t>–</w:t>
-      </w:r>
-      <w:r>
-        <w:t xml:space="preserve"> </w:t>
-      </w:r>
-      <w:r>
-        <w:t>Two-Factor Authentication</w:t>
+        <w:t>Task 2 – Two-Factor Authentication</w:t>
       </w:r>
       <w:bookmarkEnd w:id="15"/>
     </w:p>
@@ -4571,13 +5060,7 @@
         <w:pStyle w:val="AIEStandard"/>
       </w:pPr>
       <w:r>
-        <w:t xml:space="preserve">In the box below describe what 2FA </w:t>
-      </w:r>
-      <w:r>
-        <w:t>is and</w:t>
-      </w:r>
-      <w:r>
-        <w:t xml:space="preserve"> give an example of how it could be used to prevent someone logging into a website.</w:t>
+        <w:t>In the box below describe what 2FA is and give an example of how it could be used to prevent someone logging into a website.</w:t>
       </w:r>
     </w:p>
     <w:tbl>
@@ -4601,14 +5084,42 @@
                 <w:b/>
               </w:rPr>
             </w:pPr>
-          </w:p>
-          <w:p>
-            <w:pPr>
-              <w:pStyle w:val="AIEStandard"/>
+            <w:r>
               <w:rPr>
                 <w:b/>
               </w:rPr>
-            </w:pPr>
+              <w:t xml:space="preserve">2FA (Two factor authentication) is a form of authentication used to strengthen </w:t>
+            </w:r>
+            <w:r>
+              <w:rPr>
+                <w:b/>
+              </w:rPr>
+              <w:t>sign in for accounts and prevent bad actors from gaining account access. It works by verifying often via an email code or SMS to the owner of the account to verify that it is their account being logged in to.</w:t>
+            </w:r>
+            <w:r>
+              <w:rPr>
+                <w:b/>
+              </w:rPr>
+              <w:t xml:space="preserve"> For example, a hacker attempts to access a wealthy </w:t>
+            </w:r>
+            <w:r>
+              <w:rPr>
+                <w:b/>
+              </w:rPr>
+              <w:t>individual’s</w:t>
+            </w:r>
+            <w:r>
+              <w:rPr>
+                <w:b/>
+              </w:rPr>
+              <w:t xml:space="preserve"> bank account.</w:t>
+            </w:r>
+            <w:r>
+              <w:rPr>
+                <w:b/>
+              </w:rPr>
+              <w:t xml:space="preserve"> The account has 2FA enabled sending the wealthy individual a code to sign in. They are verified of an account login and the hacker cannot continue.</w:t>
+            </w:r>
           </w:p>
           <w:p>
             <w:pPr>
@@ -4652,13 +5163,7 @@
       </w:pPr>
       <w:bookmarkStart w:id="16" w:name="_Toc234248805"/>
       <w:r>
-        <w:t xml:space="preserve">Task </w:t>
-      </w:r>
-      <w:r>
-        <w:t>3</w:t>
-      </w:r>
-      <w:r>
-        <w:t xml:space="preserve"> – Strong Passwords</w:t>
+        <w:t>Task 3 – Strong Passwords</w:t>
       </w:r>
       <w:bookmarkEnd w:id="16"/>
     </w:p>
@@ -4701,6 +5206,29 @@
             <w:pPr>
               <w:pStyle w:val="AIEStandard"/>
             </w:pPr>
+            <w:r>
+              <w:t>Passwords offer varying levels of security depending on their ‘strength’</w:t>
+            </w:r>
+            <w:r>
+              <w:t>. A strong password is a combination of more than 8 characters that includes a mix of upper and lowercase characters, numbers and or symbols.</w:t>
+            </w:r>
+            <w:r>
+              <w:t xml:space="preserve"> E.g. Str0n9P@55W0rd!</w:t>
+            </w:r>
+            <w:r>
+              <w:t xml:space="preserve"> A weak password </w:t>
+            </w:r>
+            <w:r>
+              <w:t>is a password that is quite basic e.g. securePassword123.</w:t>
+            </w:r>
+          </w:p>
+          <w:p>
+            <w:pPr>
+              <w:pStyle w:val="AIEStandard"/>
+            </w:pPr>
+            <w:r>
+              <w:t xml:space="preserve">A strong password is a lot harder to guess then a weak one due to the number of possible combinations. Therefore, it is recommended that a strong password is always used. </w:t>
+            </w:r>
           </w:p>
           <w:p>
             <w:pPr>
@@ -4744,6 +5272,7 @@
           <w:b/>
           <w:bCs/>
         </w:rPr>
+        <w:lastRenderedPageBreak/>
         <w:t>WE STRONGL</w:t>
       </w:r>
       <w:r>
@@ -4908,7 +5437,6 @@
             <w:placeholder>
               <w:docPart w:val="8C294D5B60BC484FB2908B1EFFB51614"/>
             </w:placeholder>
-            <w:showingPlcHdr/>
             <w:text/>
           </w:sdtPr>
           <w:sdtContent>
@@ -4928,11 +5456,11 @@
                 </w:pPr>
                 <w:r>
                   <w:rPr>
-                    <w:rStyle w:val="PlaceholderText"/>
+                    <w:rStyle w:val="Style1"/>
                     <w:sz w:val="20"/>
                     <w:szCs w:val="20"/>
                   </w:rPr>
-                  <w:t>Please enter your name.</w:t>
+                  <w:t>Benjamin Campbell</w:t>
                 </w:r>
               </w:p>
             </w:tc>
@@ -5003,7 +5531,6 @@
             <w:placeholder>
               <w:docPart w:val="07BD660A3F874216A3C37C59127D6AC2"/>
             </w:placeholder>
-            <w:showingPlcHdr/>
             <w:text/>
           </w:sdtPr>
           <w:sdtEndPr>
@@ -5028,43 +5555,11 @@
                 </w:pPr>
                 <w:r>
                   <w:rPr>
-                    <w:rStyle w:val="PlaceholderText"/>
+                    <w:rStyle w:val="Style1"/>
                     <w:sz w:val="20"/>
                     <w:szCs w:val="20"/>
                   </w:rPr>
-                  <w:t>Please enter you</w:t>
-                </w:r>
-                <w:r>
-                  <w:rPr>
-                    <w:rStyle w:val="PlaceholderText"/>
-                    <w:sz w:val="20"/>
-                    <w:szCs w:val="20"/>
-                  </w:rPr>
-                  <w:t>r trainer’s</w:t>
-                </w:r>
-                <w:r>
-                  <w:rPr>
-                    <w:rStyle w:val="PlaceholderText"/>
-                    <w:sz w:val="20"/>
-                    <w:szCs w:val="20"/>
-                  </w:rPr>
-                  <w:t xml:space="preserve"> n</w:t>
-                </w:r>
-                <w:r>
-                  <w:rPr>
-                    <w:rStyle w:val="PlaceholderText"/>
-                    <w:sz w:val="20"/>
-                    <w:szCs w:val="20"/>
-                  </w:rPr>
-                  <w:t>ame</w:t>
-                </w:r>
-                <w:r>
-                  <w:rPr>
-                    <w:rStyle w:val="PlaceholderText"/>
-                    <w:sz w:val="20"/>
-                    <w:szCs w:val="20"/>
-                  </w:rPr>
-                  <w:t>.</w:t>
+                  <w:t>Jesse James Donlevy</w:t>
                 </w:r>
               </w:p>
             </w:tc>
@@ -5228,7 +5723,6 @@
             <w:placeholder>
               <w:docPart w:val="2D0F878A571E45FFA92BF87DBEB2014C"/>
             </w:placeholder>
-            <w:showingPlcHdr/>
             <w:text/>
           </w:sdtPr>
           <w:sdtContent>
@@ -5247,35 +5741,17 @@
                 </w:pPr>
                 <w:r>
                   <w:rPr>
-                    <w:rStyle w:val="PlaceholderText"/>
+                    <w:rFonts w:ascii="Arial" w:hAnsi="Arial" w:cs="Arial"/>
                     <w:sz w:val="20"/>
                     <w:szCs w:val="20"/>
                   </w:rPr>
-                  <w:t>As defined by your teacher</w:t>
+                  <w:t>1</w:t>
                 </w:r>
                 <w:r>
                   <w:rPr>
-                    <w:rStyle w:val="PlaceholderText"/>
-                    <w:sz w:val="18"/>
-                    <w:szCs w:val="18"/>
+                    <w:rFonts w:ascii="Arial" w:hAnsi="Arial" w:cs="Arial"/>
                   </w:rPr>
-                  <w:t>/</w:t>
-                </w:r>
-                <w:r>
-                  <w:rPr>
-                    <w:rStyle w:val="PlaceholderText"/>
-                    <w:sz w:val="20"/>
-                    <w:szCs w:val="20"/>
-                  </w:rPr>
-                  <w:t>s</w:t>
-                </w:r>
-                <w:r>
-                  <w:rPr>
-                    <w:rStyle w:val="PlaceholderText"/>
-                    <w:sz w:val="20"/>
-                    <w:szCs w:val="20"/>
-                  </w:rPr>
-                  <w:t>.</w:t>
+                  <w:t>4/07/26</w:t>
                 </w:r>
               </w:p>
             </w:tc>
@@ -5418,7 +5894,7 @@
                   </w:rPr>
                   <w:t>Will be uploaded to Canvas (</w:t>
                 </w:r>
-                <w:hyperlink r:id="rId17" w:history="1">
+                <w:hyperlink r:id="rId19" w:history="1">
                   <w:r>
                     <w:rPr>
                       <w:rStyle w:val="Hyperlink"/>
@@ -5533,53 +6009,66 @@
       </w:r>
       <w:bookmarkEnd w:id="18"/>
     </w:p>
-    <w:p>
-      <w:pPr>
-        <w:spacing w:after="0"/>
+    <w:sdt>
+      <w:sdtPr>
         <w:rPr>
-          <w:rFonts w:ascii="Arial" w:hAnsi="Arial" w:cs="Arial"/>
-          <w:b/>
+          <w:rStyle w:val="Style1"/>
         </w:rPr>
-      </w:pPr>
-      <w:sdt>
-        <w:sdtPr>
-          <w:rPr>
-            <w:rStyle w:val="Style1"/>
-          </w:rPr>
-          <w:id w:val="-1598864347"/>
-          <w:placeholder>
-            <w:docPart w:val="530DF334477440BEADC3D33516FACA4D"/>
-          </w:placeholder>
-          <w:showingPlcHdr/>
-        </w:sdtPr>
-        <w:sdtContent>
-          <w:r>
+        <w:id w:val="-1598864347"/>
+        <w:placeholder>
+          <w:docPart w:val="530DF334477440BEADC3D33516FACA4D"/>
+        </w:placeholder>
+      </w:sdtPr>
+      <w:sdtContent>
+        <w:p>
+          <w:pPr>
+            <w:spacing w:after="0"/>
             <w:rPr>
-              <w:rStyle w:val="PlaceholderText"/>
+              <w:rFonts w:ascii="Arial" w:hAnsi="Arial" w:cs="Arial"/>
+              <w:b/>
             </w:rPr>
-            <w:t xml:space="preserve">In a few short sentences or dot points, please describe your contributions to </w:t>
-          </w:r>
-          <w:r>
+          </w:pPr>
+          <w:sdt>
+            <w:sdtPr>
+              <w:rPr>
+                <w:rStyle w:val="Style1"/>
+              </w:rPr>
+              <w:id w:val="91210207"/>
+              <w:placeholder>
+                <w:docPart w:val="2528707ABC9249B695F60DB9E4772304"/>
+              </w:placeholder>
+            </w:sdtPr>
+            <w:sdtContent>
+              <w:r>
+                <w:rPr>
+                  <w:rStyle w:val="Style1"/>
+                </w:rPr>
+                <w:t>I have successfully addressed all sections to the best of my knowledge.</w:t>
+              </w:r>
+            </w:sdtContent>
+          </w:sdt>
+        </w:p>
+        <w:p>
+          <w:pPr>
+            <w:spacing w:after="0"/>
+            <w:ind w:left="-993"/>
             <w:rPr>
-              <w:rStyle w:val="PlaceholderText"/>
+              <w:rFonts w:ascii="Arial" w:hAnsi="Arial" w:cs="Arial"/>
+              <w:b/>
             </w:rPr>
-            <w:t>this</w:t>
-          </w:r>
-          <w:r>
+          </w:pPr>
+        </w:p>
+        <w:p>
+          <w:pPr>
+            <w:spacing w:after="0"/>
             <w:rPr>
-              <w:rStyle w:val="PlaceholderText"/>
+              <w:rFonts w:ascii="Arial" w:hAnsi="Arial" w:cs="Arial"/>
+              <w:b/>
             </w:rPr>
-            <w:t xml:space="preserve"> assessment item</w:t>
-          </w:r>
-          <w:r>
-            <w:rPr>
-              <w:rStyle w:val="PlaceholderText"/>
-            </w:rPr>
-            <w:t>.</w:t>
-          </w:r>
-        </w:sdtContent>
-      </w:sdt>
-    </w:p>
+          </w:pPr>
+        </w:p>
+      </w:sdtContent>
+    </w:sdt>
     <w:p>
       <w:pPr>
         <w:spacing w:after="0"/>
@@ -5912,9 +6401,9 @@
       </w:r>
     </w:p>
     <w:sectPr>
-      <w:headerReference w:type="even" r:id="rId18"/>
-      <w:headerReference w:type="default" r:id="rId19"/>
-      <w:footerReference w:type="default" r:id="rId20"/>
+      <w:headerReference w:type="even" r:id="rId20"/>
+      <w:headerReference w:type="default" r:id="rId21"/>
+      <w:footerReference w:type="default" r:id="rId22"/>
       <w:pgSz w:w="11906" w:h="16838"/>
       <w:pgMar w:top="1440" w:right="1440" w:bottom="1440" w:left="1440" w:header="170" w:footer="708" w:gutter="0"/>
       <w:pgNumType w:start="0"/>
@@ -6418,6 +6907,232 @@
 <file path=word/numbering.xml><?xml version="1.0" encoding="utf-8"?>
 <w:numbering xmlns:wpc="http://schemas.microsoft.com/office/word/2010/wordprocessingCanvas" xmlns:cx="http://schemas.microsoft.com/office/drawing/2014/chartex" xmlns:cx1="http://schemas.microsoft.com/office/drawing/2015/9/8/chartex" xmlns:cx2="http://schemas.microsoft.com/office/drawing/2015/10/21/chartex" xmlns:cx3="http://schemas.microsoft.com/office/drawing/2016/5/9/chartex" xmlns:cx4="http://schemas.microsoft.com/office/drawing/2016/5/10/chartex" xmlns:cx5="http://schemas.microsoft.com/office/drawing/2016/5/11/chartex" xmlns:cx6="http://schemas.microsoft.com/office/drawing/2016/5/12/chartex" xmlns:cx7="http://schemas.microsoft.com/office/drawing/2016/5/13/chartex" xmlns:cx8="http://schemas.microsoft.com/office/drawing/2016/5/14/chartex" xmlns:mc="http://schemas.openxmlformats.org/markup-compatibility/2006" xmlns:aink="http://schemas.microsoft.com/office/drawing/2016/ink" xmlns:am3d="http://schemas.microsoft.com/office/drawing/2017/model3d" xmlns:o="urn:schemas-microsoft-com:office:office" xmlns:oel="http://schemas.microsoft.com/office/2019/extlst" xmlns:r="http://schemas.openxmlformats.org/officeDocument/2006/relationships" xmlns:m="http://schemas.openxmlformats.org/officeDocument/2006/math" xmlns:v="urn:schemas-microsoft-com:vml" xmlns:wp14="http://schemas.microsoft.com/office/word/2010/wordprocessingDrawing" xmlns:wp="http://schemas.openxmlformats.org/drawingml/2006/wordprocessingDrawing" xmlns:w10="urn:schemas-microsoft-com:office:word" xmlns:w="http://schemas.openxmlformats.org/wordprocessingml/2006/main" xmlns:w14="http://schemas.microsoft.com/office/word/2010/wordml" xmlns:w15="http://schemas.microsoft.com/office/word/2012/wordml" xmlns:w16cex="http://schemas.microsoft.com/office/word/2018/wordml/cex" xmlns:w16cid="http://schemas.microsoft.com/office/word/2016/wordml/cid" xmlns:w16="http://schemas.microsoft.com/office/word/2018/wordml" xmlns:w16du="http://schemas.microsoft.com/office/word/2023/wordml/word16du" xmlns:w16sdtdh="http://schemas.microsoft.com/office/word/2020/wordml/sdtdatahash" xmlns:w16sdtfl="http://schemas.microsoft.com/office/word/2024/wordml/sdtformatlock" xmlns:w16se="http://schemas.microsoft.com/office/word/2015/wordml/symex" xmlns:wpg="http://schemas.microsoft.com/office/word/2010/wordprocessingGroup" xmlns:wpi="http://schemas.microsoft.com/office/word/2010/wordprocessingInk" xmlns:wne="http://schemas.microsoft.com/office/word/2006/wordml" xmlns:wps="http://schemas.microsoft.com/office/word/2010/wordprocessingShape" mc:Ignorable="w14 w15 w16se w16cid w16 w16cex w16sdtdh w16sdtfl w16du wp14">
   <w:abstractNum w:abstractNumId="0" w15:restartNumberingAfterBreak="0">
+    <w:nsid w:val="178865AA"/>
+    <w:multiLevelType w:val="hybridMultilevel"/>
+    <w:tmpl w:val="E09C6A4C"/>
+    <w:lvl w:ilvl="0" w:tplc="0C090001">
+      <w:start w:val="1"/>
+      <w:numFmt w:val="bullet"/>
+      <w:lvlText w:val=""/>
+      <w:lvlJc w:val="left"/>
+      <w:pPr>
+        <w:ind w:left="720" w:hanging="360"/>
+      </w:pPr>
+      <w:rPr>
+        <w:rFonts w:ascii="Symbol" w:hAnsi="Symbol" w:hint="default"/>
+      </w:rPr>
+    </w:lvl>
+    <w:lvl w:ilvl="1" w:tplc="0C090003" w:tentative="1">
+      <w:start w:val="1"/>
+      <w:numFmt w:val="bullet"/>
+      <w:lvlText w:val="o"/>
+      <w:lvlJc w:val="left"/>
+      <w:pPr>
+        <w:ind w:left="1440" w:hanging="360"/>
+      </w:pPr>
+      <w:rPr>
+        <w:rFonts w:ascii="Courier New" w:hAnsi="Courier New" w:cs="Courier New" w:hint="default"/>
+      </w:rPr>
+    </w:lvl>
+    <w:lvl w:ilvl="2" w:tplc="0C090005" w:tentative="1">
+      <w:start w:val="1"/>
+      <w:numFmt w:val="bullet"/>
+      <w:lvlText w:val=""/>
+      <w:lvlJc w:val="left"/>
+      <w:pPr>
+        <w:ind w:left="2160" w:hanging="360"/>
+      </w:pPr>
+      <w:rPr>
+        <w:rFonts w:ascii="Wingdings" w:hAnsi="Wingdings" w:hint="default"/>
+      </w:rPr>
+    </w:lvl>
+    <w:lvl w:ilvl="3" w:tplc="0C090001" w:tentative="1">
+      <w:start w:val="1"/>
+      <w:numFmt w:val="bullet"/>
+      <w:lvlText w:val=""/>
+      <w:lvlJc w:val="left"/>
+      <w:pPr>
+        <w:ind w:left="2880" w:hanging="360"/>
+      </w:pPr>
+      <w:rPr>
+        <w:rFonts w:ascii="Symbol" w:hAnsi="Symbol" w:hint="default"/>
+      </w:rPr>
+    </w:lvl>
+    <w:lvl w:ilvl="4" w:tplc="0C090003" w:tentative="1">
+      <w:start w:val="1"/>
+      <w:numFmt w:val="bullet"/>
+      <w:lvlText w:val="o"/>
+      <w:lvlJc w:val="left"/>
+      <w:pPr>
+        <w:ind w:left="3600" w:hanging="360"/>
+      </w:pPr>
+      <w:rPr>
+        <w:rFonts w:ascii="Courier New" w:hAnsi="Courier New" w:cs="Courier New" w:hint="default"/>
+      </w:rPr>
+    </w:lvl>
+    <w:lvl w:ilvl="5" w:tplc="0C090005" w:tentative="1">
+      <w:start w:val="1"/>
+      <w:numFmt w:val="bullet"/>
+      <w:lvlText w:val=""/>
+      <w:lvlJc w:val="left"/>
+      <w:pPr>
+        <w:ind w:left="4320" w:hanging="360"/>
+      </w:pPr>
+      <w:rPr>
+        <w:rFonts w:ascii="Wingdings" w:hAnsi="Wingdings" w:hint="default"/>
+      </w:rPr>
+    </w:lvl>
+    <w:lvl w:ilvl="6" w:tplc="0C090001" w:tentative="1">
+      <w:start w:val="1"/>
+      <w:numFmt w:val="bullet"/>
+      <w:lvlText w:val=""/>
+      <w:lvlJc w:val="left"/>
+      <w:pPr>
+        <w:ind w:left="5040" w:hanging="360"/>
+      </w:pPr>
+      <w:rPr>
+        <w:rFonts w:ascii="Symbol" w:hAnsi="Symbol" w:hint="default"/>
+      </w:rPr>
+    </w:lvl>
+    <w:lvl w:ilvl="7" w:tplc="0C090003" w:tentative="1">
+      <w:start w:val="1"/>
+      <w:numFmt w:val="bullet"/>
+      <w:lvlText w:val="o"/>
+      <w:lvlJc w:val="left"/>
+      <w:pPr>
+        <w:ind w:left="5760" w:hanging="360"/>
+      </w:pPr>
+      <w:rPr>
+        <w:rFonts w:ascii="Courier New" w:hAnsi="Courier New" w:cs="Courier New" w:hint="default"/>
+      </w:rPr>
+    </w:lvl>
+    <w:lvl w:ilvl="8" w:tplc="0C090005" w:tentative="1">
+      <w:start w:val="1"/>
+      <w:numFmt w:val="bullet"/>
+      <w:lvlText w:val=""/>
+      <w:lvlJc w:val="left"/>
+      <w:pPr>
+        <w:ind w:left="6480" w:hanging="360"/>
+      </w:pPr>
+      <w:rPr>
+        <w:rFonts w:ascii="Wingdings" w:hAnsi="Wingdings" w:hint="default"/>
+      </w:rPr>
+    </w:lvl>
+  </w:abstractNum>
+  <w:abstractNum w:abstractNumId="1" w15:restartNumberingAfterBreak="0">
+    <w:nsid w:val="298D39A0"/>
+    <w:multiLevelType w:val="hybridMultilevel"/>
+    <w:tmpl w:val="E4A659C6"/>
+    <w:lvl w:ilvl="0" w:tplc="0C090001">
+      <w:start w:val="1"/>
+      <w:numFmt w:val="bullet"/>
+      <w:lvlText w:val=""/>
+      <w:lvlJc w:val="left"/>
+      <w:pPr>
+        <w:ind w:left="720" w:hanging="360"/>
+      </w:pPr>
+      <w:rPr>
+        <w:rFonts w:ascii="Symbol" w:hAnsi="Symbol" w:hint="default"/>
+      </w:rPr>
+    </w:lvl>
+    <w:lvl w:ilvl="1" w:tplc="0C090003" w:tentative="1">
+      <w:start w:val="1"/>
+      <w:numFmt w:val="bullet"/>
+      <w:lvlText w:val="o"/>
+      <w:lvlJc w:val="left"/>
+      <w:pPr>
+        <w:ind w:left="1440" w:hanging="360"/>
+      </w:pPr>
+      <w:rPr>
+        <w:rFonts w:ascii="Courier New" w:hAnsi="Courier New" w:cs="Courier New" w:hint="default"/>
+      </w:rPr>
+    </w:lvl>
+    <w:lvl w:ilvl="2" w:tplc="0C090005" w:tentative="1">
+      <w:start w:val="1"/>
+      <w:numFmt w:val="bullet"/>
+      <w:lvlText w:val=""/>
+      <w:lvlJc w:val="left"/>
+      <w:pPr>
+        <w:ind w:left="2160" w:hanging="360"/>
+      </w:pPr>
+      <w:rPr>
+        <w:rFonts w:ascii="Wingdings" w:hAnsi="Wingdings" w:hint="default"/>
+      </w:rPr>
+    </w:lvl>
+    <w:lvl w:ilvl="3" w:tplc="0C090001" w:tentative="1">
+      <w:start w:val="1"/>
+      <w:numFmt w:val="bullet"/>
+      <w:lvlText w:val=""/>
+      <w:lvlJc w:val="left"/>
+      <w:pPr>
+        <w:ind w:left="2880" w:hanging="360"/>
+      </w:pPr>
+      <w:rPr>
+        <w:rFonts w:ascii="Symbol" w:hAnsi="Symbol" w:hint="default"/>
+      </w:rPr>
+    </w:lvl>
+    <w:lvl w:ilvl="4" w:tplc="0C090003" w:tentative="1">
+      <w:start w:val="1"/>
+      <w:numFmt w:val="bullet"/>
+      <w:lvlText w:val="o"/>
+      <w:lvlJc w:val="left"/>
+      <w:pPr>
+        <w:ind w:left="3600" w:hanging="360"/>
+      </w:pPr>
+      <w:rPr>
+        <w:rFonts w:ascii="Courier New" w:hAnsi="Courier New" w:cs="Courier New" w:hint="default"/>
+      </w:rPr>
+    </w:lvl>
+    <w:lvl w:ilvl="5" w:tplc="0C090005" w:tentative="1">
+      <w:start w:val="1"/>
+      <w:numFmt w:val="bullet"/>
+      <w:lvlText w:val=""/>
+      <w:lvlJc w:val="left"/>
+      <w:pPr>
+        <w:ind w:left="4320" w:hanging="360"/>
+      </w:pPr>
+      <w:rPr>
+        <w:rFonts w:ascii="Wingdings" w:hAnsi="Wingdings" w:hint="default"/>
+      </w:rPr>
+    </w:lvl>
+    <w:lvl w:ilvl="6" w:tplc="0C090001" w:tentative="1">
+      <w:start w:val="1"/>
+      <w:numFmt w:val="bullet"/>
+      <w:lvlText w:val=""/>
+      <w:lvlJc w:val="left"/>
+      <w:pPr>
+        <w:ind w:left="5040" w:hanging="360"/>
+      </w:pPr>
+      <w:rPr>
+        <w:rFonts w:ascii="Symbol" w:hAnsi="Symbol" w:hint="default"/>
+      </w:rPr>
+    </w:lvl>
+    <w:lvl w:ilvl="7" w:tplc="0C090003" w:tentative="1">
+      <w:start w:val="1"/>
+      <w:numFmt w:val="bullet"/>
+      <w:lvlText w:val="o"/>
+      <w:lvlJc w:val="left"/>
+      <w:pPr>
+        <w:ind w:left="5760" w:hanging="360"/>
+      </w:pPr>
+      <w:rPr>
+        <w:rFonts w:ascii="Courier New" w:hAnsi="Courier New" w:cs="Courier New" w:hint="default"/>
+      </w:rPr>
+    </w:lvl>
+    <w:lvl w:ilvl="8" w:tplc="0C090005" w:tentative="1">
+      <w:start w:val="1"/>
+      <w:numFmt w:val="bullet"/>
+      <w:lvlText w:val=""/>
+      <w:lvlJc w:val="left"/>
+      <w:pPr>
+        <w:ind w:left="6480" w:hanging="360"/>
+      </w:pPr>
+      <w:rPr>
+        <w:rFonts w:ascii="Wingdings" w:hAnsi="Wingdings" w:hint="default"/>
+      </w:rPr>
+    </w:lvl>
+  </w:abstractNum>
+  <w:abstractNum w:abstractNumId="2" w15:restartNumberingAfterBreak="0">
     <w:nsid w:val="30C701C7"/>
     <w:multiLevelType w:val="hybridMultilevel"/>
     <w:tmpl w:val="E15C34FC"/>
@@ -6503,7 +7218,572 @@
       </w:pPr>
     </w:lvl>
   </w:abstractNum>
-  <w:abstractNum w:abstractNumId="1" w15:restartNumberingAfterBreak="0">
+  <w:abstractNum w:abstractNumId="3" w15:restartNumberingAfterBreak="0">
+    <w:nsid w:val="39505F5A"/>
+    <w:multiLevelType w:val="hybridMultilevel"/>
+    <w:tmpl w:val="90CAFC56"/>
+    <w:lvl w:ilvl="0" w:tplc="0C090001">
+      <w:start w:val="1"/>
+      <w:numFmt w:val="bullet"/>
+      <w:lvlText w:val=""/>
+      <w:lvlJc w:val="left"/>
+      <w:pPr>
+        <w:ind w:left="720" w:hanging="360"/>
+      </w:pPr>
+      <w:rPr>
+        <w:rFonts w:ascii="Symbol" w:hAnsi="Symbol" w:hint="default"/>
+      </w:rPr>
+    </w:lvl>
+    <w:lvl w:ilvl="1" w:tplc="0C090003" w:tentative="1">
+      <w:start w:val="1"/>
+      <w:numFmt w:val="bullet"/>
+      <w:lvlText w:val="o"/>
+      <w:lvlJc w:val="left"/>
+      <w:pPr>
+        <w:ind w:left="1440" w:hanging="360"/>
+      </w:pPr>
+      <w:rPr>
+        <w:rFonts w:ascii="Courier New" w:hAnsi="Courier New" w:cs="Courier New" w:hint="default"/>
+      </w:rPr>
+    </w:lvl>
+    <w:lvl w:ilvl="2" w:tplc="0C090005" w:tentative="1">
+      <w:start w:val="1"/>
+      <w:numFmt w:val="bullet"/>
+      <w:lvlText w:val=""/>
+      <w:lvlJc w:val="left"/>
+      <w:pPr>
+        <w:ind w:left="2160" w:hanging="360"/>
+      </w:pPr>
+      <w:rPr>
+        <w:rFonts w:ascii="Wingdings" w:hAnsi="Wingdings" w:hint="default"/>
+      </w:rPr>
+    </w:lvl>
+    <w:lvl w:ilvl="3" w:tplc="0C090001" w:tentative="1">
+      <w:start w:val="1"/>
+      <w:numFmt w:val="bullet"/>
+      <w:lvlText w:val=""/>
+      <w:lvlJc w:val="left"/>
+      <w:pPr>
+        <w:ind w:left="2880" w:hanging="360"/>
+      </w:pPr>
+      <w:rPr>
+        <w:rFonts w:ascii="Symbol" w:hAnsi="Symbol" w:hint="default"/>
+      </w:rPr>
+    </w:lvl>
+    <w:lvl w:ilvl="4" w:tplc="0C090003" w:tentative="1">
+      <w:start w:val="1"/>
+      <w:numFmt w:val="bullet"/>
+      <w:lvlText w:val="o"/>
+      <w:lvlJc w:val="left"/>
+      <w:pPr>
+        <w:ind w:left="3600" w:hanging="360"/>
+      </w:pPr>
+      <w:rPr>
+        <w:rFonts w:ascii="Courier New" w:hAnsi="Courier New" w:cs="Courier New" w:hint="default"/>
+      </w:rPr>
+    </w:lvl>
+    <w:lvl w:ilvl="5" w:tplc="0C090005" w:tentative="1">
+      <w:start w:val="1"/>
+      <w:numFmt w:val="bullet"/>
+      <w:lvlText w:val=""/>
+      <w:lvlJc w:val="left"/>
+      <w:pPr>
+        <w:ind w:left="4320" w:hanging="360"/>
+      </w:pPr>
+      <w:rPr>
+        <w:rFonts w:ascii="Wingdings" w:hAnsi="Wingdings" w:hint="default"/>
+      </w:rPr>
+    </w:lvl>
+    <w:lvl w:ilvl="6" w:tplc="0C090001" w:tentative="1">
+      <w:start w:val="1"/>
+      <w:numFmt w:val="bullet"/>
+      <w:lvlText w:val=""/>
+      <w:lvlJc w:val="left"/>
+      <w:pPr>
+        <w:ind w:left="5040" w:hanging="360"/>
+      </w:pPr>
+      <w:rPr>
+        <w:rFonts w:ascii="Symbol" w:hAnsi="Symbol" w:hint="default"/>
+      </w:rPr>
+    </w:lvl>
+    <w:lvl w:ilvl="7" w:tplc="0C090003" w:tentative="1">
+      <w:start w:val="1"/>
+      <w:numFmt w:val="bullet"/>
+      <w:lvlText w:val="o"/>
+      <w:lvlJc w:val="left"/>
+      <w:pPr>
+        <w:ind w:left="5760" w:hanging="360"/>
+      </w:pPr>
+      <w:rPr>
+        <w:rFonts w:ascii="Courier New" w:hAnsi="Courier New" w:cs="Courier New" w:hint="default"/>
+      </w:rPr>
+    </w:lvl>
+    <w:lvl w:ilvl="8" w:tplc="0C090005" w:tentative="1">
+      <w:start w:val="1"/>
+      <w:numFmt w:val="bullet"/>
+      <w:lvlText w:val=""/>
+      <w:lvlJc w:val="left"/>
+      <w:pPr>
+        <w:ind w:left="6480" w:hanging="360"/>
+      </w:pPr>
+      <w:rPr>
+        <w:rFonts w:ascii="Wingdings" w:hAnsi="Wingdings" w:hint="default"/>
+      </w:rPr>
+    </w:lvl>
+  </w:abstractNum>
+  <w:abstractNum w:abstractNumId="4" w15:restartNumberingAfterBreak="0">
+    <w:nsid w:val="5A2743FC"/>
+    <w:multiLevelType w:val="hybridMultilevel"/>
+    <w:tmpl w:val="B99291FE"/>
+    <w:lvl w:ilvl="0" w:tplc="0C090001">
+      <w:start w:val="1"/>
+      <w:numFmt w:val="bullet"/>
+      <w:lvlText w:val=""/>
+      <w:lvlJc w:val="left"/>
+      <w:pPr>
+        <w:ind w:left="720" w:hanging="360"/>
+      </w:pPr>
+      <w:rPr>
+        <w:rFonts w:ascii="Symbol" w:hAnsi="Symbol" w:hint="default"/>
+      </w:rPr>
+    </w:lvl>
+    <w:lvl w:ilvl="1" w:tplc="0C090003" w:tentative="1">
+      <w:start w:val="1"/>
+      <w:numFmt w:val="bullet"/>
+      <w:lvlText w:val="o"/>
+      <w:lvlJc w:val="left"/>
+      <w:pPr>
+        <w:ind w:left="1440" w:hanging="360"/>
+      </w:pPr>
+      <w:rPr>
+        <w:rFonts w:ascii="Courier New" w:hAnsi="Courier New" w:cs="Courier New" w:hint="default"/>
+      </w:rPr>
+    </w:lvl>
+    <w:lvl w:ilvl="2" w:tplc="0C090005" w:tentative="1">
+      <w:start w:val="1"/>
+      <w:numFmt w:val="bullet"/>
+      <w:lvlText w:val=""/>
+      <w:lvlJc w:val="left"/>
+      <w:pPr>
+        <w:ind w:left="2160" w:hanging="360"/>
+      </w:pPr>
+      <w:rPr>
+        <w:rFonts w:ascii="Wingdings" w:hAnsi="Wingdings" w:hint="default"/>
+      </w:rPr>
+    </w:lvl>
+    <w:lvl w:ilvl="3" w:tplc="0C090001" w:tentative="1">
+      <w:start w:val="1"/>
+      <w:numFmt w:val="bullet"/>
+      <w:lvlText w:val=""/>
+      <w:lvlJc w:val="left"/>
+      <w:pPr>
+        <w:ind w:left="2880" w:hanging="360"/>
+      </w:pPr>
+      <w:rPr>
+        <w:rFonts w:ascii="Symbol" w:hAnsi="Symbol" w:hint="default"/>
+      </w:rPr>
+    </w:lvl>
+    <w:lvl w:ilvl="4" w:tplc="0C090003" w:tentative="1">
+      <w:start w:val="1"/>
+      <w:numFmt w:val="bullet"/>
+      <w:lvlText w:val="o"/>
+      <w:lvlJc w:val="left"/>
+      <w:pPr>
+        <w:ind w:left="3600" w:hanging="360"/>
+      </w:pPr>
+      <w:rPr>
+        <w:rFonts w:ascii="Courier New" w:hAnsi="Courier New" w:cs="Courier New" w:hint="default"/>
+      </w:rPr>
+    </w:lvl>
+    <w:lvl w:ilvl="5" w:tplc="0C090005" w:tentative="1">
+      <w:start w:val="1"/>
+      <w:numFmt w:val="bullet"/>
+      <w:lvlText w:val=""/>
+      <w:lvlJc w:val="left"/>
+      <w:pPr>
+        <w:ind w:left="4320" w:hanging="360"/>
+      </w:pPr>
+      <w:rPr>
+        <w:rFonts w:ascii="Wingdings" w:hAnsi="Wingdings" w:hint="default"/>
+      </w:rPr>
+    </w:lvl>
+    <w:lvl w:ilvl="6" w:tplc="0C090001" w:tentative="1">
+      <w:start w:val="1"/>
+      <w:numFmt w:val="bullet"/>
+      <w:lvlText w:val=""/>
+      <w:lvlJc w:val="left"/>
+      <w:pPr>
+        <w:ind w:left="5040" w:hanging="360"/>
+      </w:pPr>
+      <w:rPr>
+        <w:rFonts w:ascii="Symbol" w:hAnsi="Symbol" w:hint="default"/>
+      </w:rPr>
+    </w:lvl>
+    <w:lvl w:ilvl="7" w:tplc="0C090003" w:tentative="1">
+      <w:start w:val="1"/>
+      <w:numFmt w:val="bullet"/>
+      <w:lvlText w:val="o"/>
+      <w:lvlJc w:val="left"/>
+      <w:pPr>
+        <w:ind w:left="5760" w:hanging="360"/>
+      </w:pPr>
+      <w:rPr>
+        <w:rFonts w:ascii="Courier New" w:hAnsi="Courier New" w:cs="Courier New" w:hint="default"/>
+      </w:rPr>
+    </w:lvl>
+    <w:lvl w:ilvl="8" w:tplc="0C090005" w:tentative="1">
+      <w:start w:val="1"/>
+      <w:numFmt w:val="bullet"/>
+      <w:lvlText w:val=""/>
+      <w:lvlJc w:val="left"/>
+      <w:pPr>
+        <w:ind w:left="6480" w:hanging="360"/>
+      </w:pPr>
+      <w:rPr>
+        <w:rFonts w:ascii="Wingdings" w:hAnsi="Wingdings" w:hint="default"/>
+      </w:rPr>
+    </w:lvl>
+  </w:abstractNum>
+  <w:abstractNum w:abstractNumId="5" w15:restartNumberingAfterBreak="0">
+    <w:nsid w:val="606F544E"/>
+    <w:multiLevelType w:val="hybridMultilevel"/>
+    <w:tmpl w:val="FA2C2ED2"/>
+    <w:lvl w:ilvl="0" w:tplc="0C090001">
+      <w:start w:val="1"/>
+      <w:numFmt w:val="bullet"/>
+      <w:lvlText w:val=""/>
+      <w:lvlJc w:val="left"/>
+      <w:pPr>
+        <w:ind w:left="720" w:hanging="360"/>
+      </w:pPr>
+      <w:rPr>
+        <w:rFonts w:ascii="Symbol" w:hAnsi="Symbol" w:hint="default"/>
+      </w:rPr>
+    </w:lvl>
+    <w:lvl w:ilvl="1" w:tplc="0C090003" w:tentative="1">
+      <w:start w:val="1"/>
+      <w:numFmt w:val="bullet"/>
+      <w:lvlText w:val="o"/>
+      <w:lvlJc w:val="left"/>
+      <w:pPr>
+        <w:ind w:left="1440" w:hanging="360"/>
+      </w:pPr>
+      <w:rPr>
+        <w:rFonts w:ascii="Courier New" w:hAnsi="Courier New" w:cs="Courier New" w:hint="default"/>
+      </w:rPr>
+    </w:lvl>
+    <w:lvl w:ilvl="2" w:tplc="0C090005" w:tentative="1">
+      <w:start w:val="1"/>
+      <w:numFmt w:val="bullet"/>
+      <w:lvlText w:val=""/>
+      <w:lvlJc w:val="left"/>
+      <w:pPr>
+        <w:ind w:left="2160" w:hanging="360"/>
+      </w:pPr>
+      <w:rPr>
+        <w:rFonts w:ascii="Wingdings" w:hAnsi="Wingdings" w:hint="default"/>
+      </w:rPr>
+    </w:lvl>
+    <w:lvl w:ilvl="3" w:tplc="0C090001" w:tentative="1">
+      <w:start w:val="1"/>
+      <w:numFmt w:val="bullet"/>
+      <w:lvlText w:val=""/>
+      <w:lvlJc w:val="left"/>
+      <w:pPr>
+        <w:ind w:left="2880" w:hanging="360"/>
+      </w:pPr>
+      <w:rPr>
+        <w:rFonts w:ascii="Symbol" w:hAnsi="Symbol" w:hint="default"/>
+      </w:rPr>
+    </w:lvl>
+    <w:lvl w:ilvl="4" w:tplc="0C090003" w:tentative="1">
+      <w:start w:val="1"/>
+      <w:numFmt w:val="bullet"/>
+      <w:lvlText w:val="o"/>
+      <w:lvlJc w:val="left"/>
+      <w:pPr>
+        <w:ind w:left="3600" w:hanging="360"/>
+      </w:pPr>
+      <w:rPr>
+        <w:rFonts w:ascii="Courier New" w:hAnsi="Courier New" w:cs="Courier New" w:hint="default"/>
+      </w:rPr>
+    </w:lvl>
+    <w:lvl w:ilvl="5" w:tplc="0C090005" w:tentative="1">
+      <w:start w:val="1"/>
+      <w:numFmt w:val="bullet"/>
+      <w:lvlText w:val=""/>
+      <w:lvlJc w:val="left"/>
+      <w:pPr>
+        <w:ind w:left="4320" w:hanging="360"/>
+      </w:pPr>
+      <w:rPr>
+        <w:rFonts w:ascii="Wingdings" w:hAnsi="Wingdings" w:hint="default"/>
+      </w:rPr>
+    </w:lvl>
+    <w:lvl w:ilvl="6" w:tplc="0C090001" w:tentative="1">
+      <w:start w:val="1"/>
+      <w:numFmt w:val="bullet"/>
+      <w:lvlText w:val=""/>
+      <w:lvlJc w:val="left"/>
+      <w:pPr>
+        <w:ind w:left="5040" w:hanging="360"/>
+      </w:pPr>
+      <w:rPr>
+        <w:rFonts w:ascii="Symbol" w:hAnsi="Symbol" w:hint="default"/>
+      </w:rPr>
+    </w:lvl>
+    <w:lvl w:ilvl="7" w:tplc="0C090003" w:tentative="1">
+      <w:start w:val="1"/>
+      <w:numFmt w:val="bullet"/>
+      <w:lvlText w:val="o"/>
+      <w:lvlJc w:val="left"/>
+      <w:pPr>
+        <w:ind w:left="5760" w:hanging="360"/>
+      </w:pPr>
+      <w:rPr>
+        <w:rFonts w:ascii="Courier New" w:hAnsi="Courier New" w:cs="Courier New" w:hint="default"/>
+      </w:rPr>
+    </w:lvl>
+    <w:lvl w:ilvl="8" w:tplc="0C090005" w:tentative="1">
+      <w:start w:val="1"/>
+      <w:numFmt w:val="bullet"/>
+      <w:lvlText w:val=""/>
+      <w:lvlJc w:val="left"/>
+      <w:pPr>
+        <w:ind w:left="6480" w:hanging="360"/>
+      </w:pPr>
+      <w:rPr>
+        <w:rFonts w:ascii="Wingdings" w:hAnsi="Wingdings" w:hint="default"/>
+      </w:rPr>
+    </w:lvl>
+  </w:abstractNum>
+  <w:abstractNum w:abstractNumId="6" w15:restartNumberingAfterBreak="0">
+    <w:nsid w:val="681E1297"/>
+    <w:multiLevelType w:val="hybridMultilevel"/>
+    <w:tmpl w:val="DF1A633E"/>
+    <w:lvl w:ilvl="0" w:tplc="0C090001">
+      <w:start w:val="1"/>
+      <w:numFmt w:val="bullet"/>
+      <w:lvlText w:val=""/>
+      <w:lvlJc w:val="left"/>
+      <w:pPr>
+        <w:ind w:left="720" w:hanging="360"/>
+      </w:pPr>
+      <w:rPr>
+        <w:rFonts w:ascii="Symbol" w:hAnsi="Symbol" w:hint="default"/>
+      </w:rPr>
+    </w:lvl>
+    <w:lvl w:ilvl="1" w:tplc="0C090003" w:tentative="1">
+      <w:start w:val="1"/>
+      <w:numFmt w:val="bullet"/>
+      <w:lvlText w:val="o"/>
+      <w:lvlJc w:val="left"/>
+      <w:pPr>
+        <w:ind w:left="1440" w:hanging="360"/>
+      </w:pPr>
+      <w:rPr>
+        <w:rFonts w:ascii="Courier New" w:hAnsi="Courier New" w:cs="Courier New" w:hint="default"/>
+      </w:rPr>
+    </w:lvl>
+    <w:lvl w:ilvl="2" w:tplc="0C090005" w:tentative="1">
+      <w:start w:val="1"/>
+      <w:numFmt w:val="bullet"/>
+      <w:lvlText w:val=""/>
+      <w:lvlJc w:val="left"/>
+      <w:pPr>
+        <w:ind w:left="2160" w:hanging="360"/>
+      </w:pPr>
+      <w:rPr>
+        <w:rFonts w:ascii="Wingdings" w:hAnsi="Wingdings" w:hint="default"/>
+      </w:rPr>
+    </w:lvl>
+    <w:lvl w:ilvl="3" w:tplc="0C090001" w:tentative="1">
+      <w:start w:val="1"/>
+      <w:numFmt w:val="bullet"/>
+      <w:lvlText w:val=""/>
+      <w:lvlJc w:val="left"/>
+      <w:pPr>
+        <w:ind w:left="2880" w:hanging="360"/>
+      </w:pPr>
+      <w:rPr>
+        <w:rFonts w:ascii="Symbol" w:hAnsi="Symbol" w:hint="default"/>
+      </w:rPr>
+    </w:lvl>
+    <w:lvl w:ilvl="4" w:tplc="0C090003" w:tentative="1">
+      <w:start w:val="1"/>
+      <w:numFmt w:val="bullet"/>
+      <w:lvlText w:val="o"/>
+      <w:lvlJc w:val="left"/>
+      <w:pPr>
+        <w:ind w:left="3600" w:hanging="360"/>
+      </w:pPr>
+      <w:rPr>
+        <w:rFonts w:ascii="Courier New" w:hAnsi="Courier New" w:cs="Courier New" w:hint="default"/>
+      </w:rPr>
+    </w:lvl>
+    <w:lvl w:ilvl="5" w:tplc="0C090005" w:tentative="1">
+      <w:start w:val="1"/>
+      <w:numFmt w:val="bullet"/>
+      <w:lvlText w:val=""/>
+      <w:lvlJc w:val="left"/>
+      <w:pPr>
+        <w:ind w:left="4320" w:hanging="360"/>
+      </w:pPr>
+      <w:rPr>
+        <w:rFonts w:ascii="Wingdings" w:hAnsi="Wingdings" w:hint="default"/>
+      </w:rPr>
+    </w:lvl>
+    <w:lvl w:ilvl="6" w:tplc="0C090001" w:tentative="1">
+      <w:start w:val="1"/>
+      <w:numFmt w:val="bullet"/>
+      <w:lvlText w:val=""/>
+      <w:lvlJc w:val="left"/>
+      <w:pPr>
+        <w:ind w:left="5040" w:hanging="360"/>
+      </w:pPr>
+      <w:rPr>
+        <w:rFonts w:ascii="Symbol" w:hAnsi="Symbol" w:hint="default"/>
+      </w:rPr>
+    </w:lvl>
+    <w:lvl w:ilvl="7" w:tplc="0C090003" w:tentative="1">
+      <w:start w:val="1"/>
+      <w:numFmt w:val="bullet"/>
+      <w:lvlText w:val="o"/>
+      <w:lvlJc w:val="left"/>
+      <w:pPr>
+        <w:ind w:left="5760" w:hanging="360"/>
+      </w:pPr>
+      <w:rPr>
+        <w:rFonts w:ascii="Courier New" w:hAnsi="Courier New" w:cs="Courier New" w:hint="default"/>
+      </w:rPr>
+    </w:lvl>
+    <w:lvl w:ilvl="8" w:tplc="0C090005" w:tentative="1">
+      <w:start w:val="1"/>
+      <w:numFmt w:val="bullet"/>
+      <w:lvlText w:val=""/>
+      <w:lvlJc w:val="left"/>
+      <w:pPr>
+        <w:ind w:left="6480" w:hanging="360"/>
+      </w:pPr>
+      <w:rPr>
+        <w:rFonts w:ascii="Wingdings" w:hAnsi="Wingdings" w:hint="default"/>
+      </w:rPr>
+    </w:lvl>
+  </w:abstractNum>
+  <w:abstractNum w:abstractNumId="7" w15:restartNumberingAfterBreak="0">
+    <w:nsid w:val="6F4D23FD"/>
+    <w:multiLevelType w:val="hybridMultilevel"/>
+    <w:tmpl w:val="91DE83F8"/>
+    <w:lvl w:ilvl="0" w:tplc="0C090001">
+      <w:start w:val="1"/>
+      <w:numFmt w:val="bullet"/>
+      <w:lvlText w:val=""/>
+      <w:lvlJc w:val="left"/>
+      <w:pPr>
+        <w:ind w:left="720" w:hanging="360"/>
+      </w:pPr>
+      <w:rPr>
+        <w:rFonts w:ascii="Symbol" w:hAnsi="Symbol" w:hint="default"/>
+      </w:rPr>
+    </w:lvl>
+    <w:lvl w:ilvl="1" w:tplc="0C090003" w:tentative="1">
+      <w:start w:val="1"/>
+      <w:numFmt w:val="bullet"/>
+      <w:lvlText w:val="o"/>
+      <w:lvlJc w:val="left"/>
+      <w:pPr>
+        <w:ind w:left="1440" w:hanging="360"/>
+      </w:pPr>
+      <w:rPr>
+        <w:rFonts w:ascii="Courier New" w:hAnsi="Courier New" w:cs="Courier New" w:hint="default"/>
+      </w:rPr>
+    </w:lvl>
+    <w:lvl w:ilvl="2" w:tplc="0C090005" w:tentative="1">
+      <w:start w:val="1"/>
+      <w:numFmt w:val="bullet"/>
+      <w:lvlText w:val=""/>
+      <w:lvlJc w:val="left"/>
+      <w:pPr>
+        <w:ind w:left="2160" w:hanging="360"/>
+      </w:pPr>
+      <w:rPr>
+        <w:rFonts w:ascii="Wingdings" w:hAnsi="Wingdings" w:hint="default"/>
+      </w:rPr>
+    </w:lvl>
+    <w:lvl w:ilvl="3" w:tplc="0C090001" w:tentative="1">
+      <w:start w:val="1"/>
+      <w:numFmt w:val="bullet"/>
+      <w:lvlText w:val=""/>
+      <w:lvlJc w:val="left"/>
+      <w:pPr>
+        <w:ind w:left="2880" w:hanging="360"/>
+      </w:pPr>
+      <w:rPr>
+        <w:rFonts w:ascii="Symbol" w:hAnsi="Symbol" w:hint="default"/>
+      </w:rPr>
+    </w:lvl>
+    <w:lvl w:ilvl="4" w:tplc="0C090003" w:tentative="1">
+      <w:start w:val="1"/>
+      <w:numFmt w:val="bullet"/>
+      <w:lvlText w:val="o"/>
+      <w:lvlJc w:val="left"/>
+      <w:pPr>
+        <w:ind w:left="3600" w:hanging="360"/>
+      </w:pPr>
+      <w:rPr>
+        <w:rFonts w:ascii="Courier New" w:hAnsi="Courier New" w:cs="Courier New" w:hint="default"/>
+      </w:rPr>
+    </w:lvl>
+    <w:lvl w:ilvl="5" w:tplc="0C090005" w:tentative="1">
+      <w:start w:val="1"/>
+      <w:numFmt w:val="bullet"/>
+      <w:lvlText w:val=""/>
+      <w:lvlJc w:val="left"/>
+      <w:pPr>
+        <w:ind w:left="4320" w:hanging="360"/>
+      </w:pPr>
+      <w:rPr>
+        <w:rFonts w:ascii="Wingdings" w:hAnsi="Wingdings" w:hint="default"/>
+      </w:rPr>
+    </w:lvl>
+    <w:lvl w:ilvl="6" w:tplc="0C090001" w:tentative="1">
+      <w:start w:val="1"/>
+      <w:numFmt w:val="bullet"/>
+      <w:lvlText w:val=""/>
+      <w:lvlJc w:val="left"/>
+      <w:pPr>
+        <w:ind w:left="5040" w:hanging="360"/>
+      </w:pPr>
+      <w:rPr>
+        <w:rFonts w:ascii="Symbol" w:hAnsi="Symbol" w:hint="default"/>
+      </w:rPr>
+    </w:lvl>
+    <w:lvl w:ilvl="7" w:tplc="0C090003" w:tentative="1">
+      <w:start w:val="1"/>
+      <w:numFmt w:val="bullet"/>
+      <w:lvlText w:val="o"/>
+      <w:lvlJc w:val="left"/>
+      <w:pPr>
+        <w:ind w:left="5760" w:hanging="360"/>
+      </w:pPr>
+      <w:rPr>
+        <w:rFonts w:ascii="Courier New" w:hAnsi="Courier New" w:cs="Courier New" w:hint="default"/>
+      </w:rPr>
+    </w:lvl>
+    <w:lvl w:ilvl="8" w:tplc="0C090005" w:tentative="1">
+      <w:start w:val="1"/>
+      <w:numFmt w:val="bullet"/>
+      <w:lvlText w:val=""/>
+      <w:lvlJc w:val="left"/>
+      <w:pPr>
+        <w:ind w:left="6480" w:hanging="360"/>
+      </w:pPr>
+      <w:rPr>
+        <w:rFonts w:ascii="Wingdings" w:hAnsi="Wingdings" w:hint="default"/>
+      </w:rPr>
+    </w:lvl>
+  </w:abstractNum>
+  <w:abstractNum w:abstractNumId="8" w15:restartNumberingAfterBreak="0">
     <w:nsid w:val="776E0360"/>
     <w:multiLevelType w:val="hybridMultilevel"/>
     <w:tmpl w:val="69FC5988"/>
@@ -6617,10 +7897,31 @@
     </w:lvl>
   </w:abstractNum>
   <w:num w:numId="1" w16cid:durableId="792482711">
+    <w:abstractNumId w:val="8"/>
+  </w:num>
+  <w:num w:numId="2" w16cid:durableId="1935161972">
+    <w:abstractNumId w:val="2"/>
+  </w:num>
+  <w:num w:numId="3" w16cid:durableId="420106063">
+    <w:abstractNumId w:val="4"/>
+  </w:num>
+  <w:num w:numId="4" w16cid:durableId="789713936">
+    <w:abstractNumId w:val="5"/>
+  </w:num>
+  <w:num w:numId="5" w16cid:durableId="1760179700">
+    <w:abstractNumId w:val="0"/>
+  </w:num>
+  <w:num w:numId="6" w16cid:durableId="1086881607">
     <w:abstractNumId w:val="1"/>
   </w:num>
-  <w:num w:numId="2" w16cid:durableId="1935161972">
-    <w:abstractNumId w:val="0"/>
+  <w:num w:numId="7" w16cid:durableId="540289754">
+    <w:abstractNumId w:val="3"/>
+  </w:num>
+  <w:num w:numId="8" w16cid:durableId="882710521">
+    <w:abstractNumId w:val="6"/>
+  </w:num>
+  <w:num w:numId="9" w16cid:durableId="551379773">
+    <w:abstractNumId w:val="7"/>
   </w:num>
 </w:numbering>
 </file>
@@ -7860,6 +9161,18 @@
       <w:rFonts w:ascii="Calibri" w:eastAsiaTheme="minorHAnsi" w:hAnsi="Calibri"/>
     </w:rPr>
   </w:style>
+  <w:style w:type="character" w:styleId="FollowedHyperlink">
+    <w:name w:val="FollowedHyperlink"/>
+    <w:basedOn w:val="DefaultParagraphFont"/>
+    <w:uiPriority w:val="99"/>
+    <w:semiHidden/>
+    <w:unhideWhenUsed/>
+    <w:rsid w:val="008066FD"/>
+    <w:rPr>
+      <w:color w:val="800080" w:themeColor="followedHyperlink"/>
+      <w:u w:val="single"/>
+    </w:rPr>
+  </w:style>
 </w:styles>
 </file>
 
@@ -8356,12 +9669,75 @@
         </w:p>
       </w:docPartBody>
     </w:docPart>
+    <w:docPart>
+      <w:docPartPr>
+        <w:name w:val="2528707ABC9249B695F60DB9E4772304"/>
+        <w:category>
+          <w:name w:val="General"/>
+          <w:gallery w:val="placeholder"/>
+        </w:category>
+        <w:types>
+          <w:type w:val="bbPlcHdr"/>
+        </w:types>
+        <w:behaviors>
+          <w:behavior w:val="content"/>
+        </w:behaviors>
+        <w:guid w:val="{5917A1B5-09DC-4ECE-9A48-D1BA49FFDA0D}"/>
+      </w:docPartPr>
+      <w:docPartBody>
+        <w:p>
+          <w:pPr>
+            <w:pStyle w:val="2528707ABC9249B695F60DB9E4772304"/>
+          </w:pPr>
+          <w:r>
+            <w:rPr>
+              <w:rStyle w:val="PlaceholderText"/>
+            </w:rPr>
+            <w:t>In a few short sentences or dot points, please describe your contributions to this assessment item</w:t>
+          </w:r>
+          <w:r>
+            <w:rPr>
+              <w:rStyle w:val="PlaceholderText"/>
+            </w:rPr>
+            <w:t>.</w:t>
+          </w:r>
+        </w:p>
+      </w:docPartBody>
+    </w:docPart>
   </w:docParts>
 </w:glossaryDocument>
 </file>
 
 <file path=word/glossary/fontTable.xml><?xml version="1.0" encoding="utf-8"?>
 <w:fonts xmlns:mc="http://schemas.openxmlformats.org/markup-compatibility/2006" xmlns:r="http://schemas.openxmlformats.org/officeDocument/2006/relationships" xmlns:w="http://schemas.openxmlformats.org/wordprocessingml/2006/main" xmlns:w14="http://schemas.microsoft.com/office/word/2010/wordml" xmlns:w15="http://schemas.microsoft.com/office/word/2012/wordml" xmlns:w16cex="http://schemas.microsoft.com/office/word/2018/wordml/cex" xmlns:w16cid="http://schemas.microsoft.com/office/word/2016/wordml/cid" xmlns:w16="http://schemas.microsoft.com/office/word/2018/wordml" xmlns:w16du="http://schemas.microsoft.com/office/word/2023/wordml/word16du" xmlns:w16sdtdh="http://schemas.microsoft.com/office/word/2020/wordml/sdtdatahash" xmlns:w16sdtfl="http://schemas.microsoft.com/office/word/2024/wordml/sdtformatlock" xmlns:w16se="http://schemas.microsoft.com/office/word/2015/wordml/symex" mc:Ignorable="w14 w15 w16se w16cid w16 w16cex w16sdtdh w16sdtfl w16du">
+  <w:font w:name="Symbol">
+    <w:panose1 w:val="05050102010706020507"/>
+    <w:charset w:val="02"/>
+    <w:family w:val="roman"/>
+    <w:pitch w:val="variable"/>
+    <w:sig w:usb0="00000000" w:usb1="10000000" w:usb2="00000000" w:usb3="00000000" w:csb0="80000000" w:csb1="00000000"/>
+  </w:font>
+  <w:font w:name="Times New Roman">
+    <w:panose1 w:val="02020603050405020304"/>
+    <w:charset w:val="00"/>
+    <w:family w:val="roman"/>
+    <w:pitch w:val="variable"/>
+    <w:sig w:usb0="E0002EFF" w:usb1="C000785B" w:usb2="00000009" w:usb3="00000000" w:csb0="000001FF" w:csb1="00000000"/>
+  </w:font>
+  <w:font w:name="Courier New">
+    <w:panose1 w:val="02070309020205020404"/>
+    <w:charset w:val="00"/>
+    <w:family w:val="modern"/>
+    <w:pitch w:val="fixed"/>
+    <w:sig w:usb0="E0002EFF" w:usb1="C0007843" w:usb2="00000009" w:usb3="00000000" w:csb0="000001FF" w:csb1="00000000"/>
+  </w:font>
+  <w:font w:name="Wingdings">
+    <w:panose1 w:val="05000000000000000000"/>
+    <w:charset w:val="02"/>
+    <w:family w:val="auto"/>
+    <w:pitch w:val="variable"/>
+    <w:sig w:usb0="00000000" w:usb1="10000000" w:usb2="00000000" w:usb3="00000000" w:csb0="80000000" w:csb1="00000000"/>
+  </w:font>
   <w:font w:name="Calibri">
     <w:panose1 w:val="020F0502020204030204"/>
     <w:charset w:val="00"/>
@@ -8376,13 +9752,6 @@
     <w:pitch w:val="variable"/>
     <w:sig w:usb0="E00002FF" w:usb1="6AC7FDFB" w:usb2="08000012" w:usb3="00000000" w:csb0="0002009F" w:csb1="00000000"/>
   </w:font>
-  <w:font w:name="Times New Roman">
-    <w:panose1 w:val="02020603050405020304"/>
-    <w:charset w:val="00"/>
-    <w:family w:val="roman"/>
-    <w:pitch w:val="variable"/>
-    <w:sig w:usb0="E0002EFF" w:usb1="C000785B" w:usb2="00000009" w:usb3="00000000" w:csb0="000001FF" w:csb1="00000000"/>
-  </w:font>
   <w:font w:name="Tahoma">
     <w:panose1 w:val="020B0604030504040204"/>
     <w:charset w:val="00"/>
@@ -8391,7 +9760,7 @@
     <w:sig w:usb0="E1002EFF" w:usb1="C000605B" w:usb2="00000029" w:usb3="00000000" w:csb0="000101FF" w:csb1="00000000"/>
   </w:font>
   <w:font w:name="Assistant Medium">
-    <w:panose1 w:val="00000000000000000000"/>
+    <w:altName w:val="Arial"/>
     <w:charset w:val="00"/>
     <w:family w:val="auto"/>
     <w:pitch w:val="variable"/>
@@ -8455,12 +9824,15 @@
     <w:rsid w:val="001848F7"/>
     <w:rsid w:val="001F5A26"/>
     <w:rsid w:val="00316122"/>
+    <w:rsid w:val="00527822"/>
     <w:rsid w:val="005365A8"/>
+    <w:rsid w:val="00743AC6"/>
     <w:rsid w:val="00884B51"/>
     <w:rsid w:val="00B02621"/>
     <w:rsid w:val="00C67A85"/>
     <w:rsid w:val="00D13357"/>
     <w:rsid w:val="00D62E91"/>
+    <w:rsid w:val="00EC3212"/>
   </w:rsids>
   <m:mathPr>
     <m:mathFont m:val="Cambria Math"/>
@@ -8948,7 +10320,7 @@
     <w:basedOn w:val="DefaultParagraphFont"/>
     <w:uiPriority w:val="99"/>
     <w:semiHidden/>
-    <w:rsid w:val="00B02621"/>
+    <w:rsid w:val="00743AC6"/>
     <w:rPr>
       <w:color w:val="808080"/>
     </w:rPr>
@@ -9051,6 +10423,10 @@
     <w:basedOn w:val="DefaultParagraphFont"/>
     <w:uiPriority w:val="1"/>
     <w:rsid w:val="00B02621"/>
+  </w:style>
+  <w:style w:type="paragraph" w:customStyle="1" w:styleId="2528707ABC9249B695F60DB9E4772304">
+    <w:name w:val="2528707ABC9249B695F60DB9E4772304"/>
+    <w:rsid w:val="00743AC6"/>
   </w:style>
 </w:styles>
 </file>
@@ -9348,25 +10724,6 @@
 </file>
 
 <file path=customXml/item1.xml><?xml version="1.0" encoding="utf-8"?>
-<b:Sources xmlns:b="http://schemas.openxmlformats.org/officeDocument/2006/bibliography" xmlns="http://schemas.openxmlformats.org/officeDocument/2006/bibliography" SelectedStyle="\APA.XSL" StyleName="APA"/>
-</file>
-
-<file path=customXml/item2.xml><?xml version="1.0" encoding="utf-8"?>
-<p:properties xmlns:p="http://schemas.microsoft.com/office/2006/metadata/properties" xmlns:xsi="http://www.w3.org/2001/XMLSchema-instance" xmlns:pc="http://schemas.microsoft.com/office/infopath/2007/PartnerControls">
-  <documentManagement/>
-</p:properties>
-</file>
-
-<file path=customXml/item3.xml><?xml version="1.0" encoding="utf-8"?>
-<?mso-contentType ?>
-<FormTemplates xmlns="http://schemas.microsoft.com/sharepoint/v3/contenttype/forms">
-  <Display>DocumentLibraryForm</Display>
-  <Edit>DocumentLibraryForm</Edit>
-  <New>DocumentLibraryForm</New>
-</FormTemplates>
-</file>
-
-<file path=customXml/item4.xml><?xml version="1.0" encoding="utf-8"?>
 <ct:contentTypeSchema xmlns:ct="http://schemas.microsoft.com/office/2006/metadata/contentType" xmlns:ma="http://schemas.microsoft.com/office/2006/metadata/properties/metaAttributes" ct:_="" ma:_="" ma:contentTypeName="Document" ma:contentTypeID="0x010100662FE754E88CF849A79823970E298C02" ma:contentTypeVersion="0" ma:contentTypeDescription="Create a new document." ma:contentTypeScope="" ma:versionID="a3ccd6cea9ac3821f658e30a0c8e2da2">
   <xsd:schema xmlns:xsd="http://www.w3.org/2001/XMLSchema" xmlns:xs="http://www.w3.org/2001/XMLSchema" xmlns:p="http://schemas.microsoft.com/office/2006/metadata/properties" targetNamespace="http://schemas.microsoft.com/office/2006/metadata/properties" ma:root="true" ma:fieldsID="4b795196365d0a2ba85bf44c386000f7">
     <xsd:element name="properties">
@@ -9480,15 +10837,50 @@
 </ct:contentTypeSchema>
 </file>
 
+<file path=customXml/item2.xml><?xml version="1.0" encoding="utf-8"?>
+<?mso-contentType ?>
+<FormTemplates xmlns="http://schemas.microsoft.com/sharepoint/v3/contenttype/forms">
+  <Display>DocumentLibraryForm</Display>
+  <Edit>DocumentLibraryForm</Edit>
+  <New>DocumentLibraryForm</New>
+</FormTemplates>
+</file>
+
+<file path=customXml/item3.xml><?xml version="1.0" encoding="utf-8"?>
+<p:properties xmlns:p="http://schemas.microsoft.com/office/2006/metadata/properties" xmlns:xsi="http://www.w3.org/2001/XMLSchema-instance" xmlns:pc="http://schemas.microsoft.com/office/infopath/2007/PartnerControls">
+  <documentManagement/>
+</p:properties>
+</file>
+
+<file path=customXml/item4.xml><?xml version="1.0" encoding="utf-8"?>
+<b:Sources xmlns:b="http://schemas.openxmlformats.org/officeDocument/2006/bibliography" xmlns="http://schemas.openxmlformats.org/officeDocument/2006/bibliography" SelectedStyle="\APA.XSL" StyleName="APA"/>
+</file>
+
 <file path=customXml/itemProps1.xml><?xml version="1.0" encoding="utf-8"?>
-<ds:datastoreItem xmlns:ds="http://schemas.openxmlformats.org/officeDocument/2006/customXml" ds:itemID="{F8138C68-1874-4B4E-A6FD-B326030F7F33}">
+<ds:datastoreItem xmlns:ds="http://schemas.openxmlformats.org/officeDocument/2006/customXml" ds:itemID="{28F0E795-F19A-46E6-9516-D73D5998FE67}">
   <ds:schemaRefs>
-    <ds:schemaRef ds:uri="http://schemas.openxmlformats.org/officeDocument/2006/bibliography"/>
+    <ds:schemaRef ds:uri="http://schemas.microsoft.com/office/2006/metadata/contentType"/>
+    <ds:schemaRef ds:uri="http://schemas.microsoft.com/office/2006/metadata/properties/metaAttributes"/>
+    <ds:schemaRef ds:uri="http://www.w3.org/2001/XMLSchema"/>
+    <ds:schemaRef ds:uri="http://schemas.microsoft.com/office/2006/metadata/properties"/>
+    <ds:schemaRef ds:uri="http://schemas.openxmlformats.org/package/2006/metadata/core-properties"/>
+    <ds:schemaRef ds:uri="http://purl.org/dc/elements/1.1/"/>
+    <ds:schemaRef ds:uri="http://purl.org/dc/terms/"/>
+    <ds:schemaRef ds:uri="http://schemas.microsoft.com/internal/obd"/>
+    <ds:schemaRef ds:uri="http://schemas.microsoft.com/office/infopath/2007/PartnerControls"/>
   </ds:schemaRefs>
 </ds:datastoreItem>
 </file>
 
 <file path=customXml/itemProps2.xml><?xml version="1.0" encoding="utf-8"?>
+<ds:datastoreItem xmlns:ds="http://schemas.openxmlformats.org/officeDocument/2006/customXml" ds:itemID="{26700EF2-408B-449A-910D-B8624308E6A0}">
+  <ds:schemaRefs>
+    <ds:schemaRef ds:uri="http://schemas.microsoft.com/sharepoint/v3/contenttype/forms"/>
+  </ds:schemaRefs>
+</ds:datastoreItem>
+</file>
+
+<file path=customXml/itemProps3.xml><?xml version="1.0" encoding="utf-8"?>
 <ds:datastoreItem xmlns:ds="http://schemas.openxmlformats.org/officeDocument/2006/customXml" ds:itemID="{0A4FF426-28BF-4C02-BD34-99625C7781F6}">
   <ds:schemaRefs>
     <ds:schemaRef ds:uri="http://schemas.microsoft.com/office/2006/metadata/properties"/>
@@ -9497,14 +10889,10 @@
 </ds:datastoreItem>
 </file>
 
-<file path=customXml/itemProps3.xml><?xml version="1.0" encoding="utf-8"?>
-<ds:datastoreItem xmlns:ds="http://schemas.openxmlformats.org/officeDocument/2006/customXml" ds:itemID="{26700EF2-408B-449A-910D-B8624308E6A0}">
+<file path=customXml/itemProps4.xml><?xml version="1.0" encoding="utf-8"?>
+<ds:datastoreItem xmlns:ds="http://schemas.openxmlformats.org/officeDocument/2006/customXml" ds:itemID="{F8138C68-1874-4B4E-A6FD-B326030F7F33}">
   <ds:schemaRefs>
-    <ds:schemaRef ds:uri="http://schemas.microsoft.com/sharepoint/v3/contenttype/forms"/>
+    <ds:schemaRef ds:uri="http://schemas.openxmlformats.org/officeDocument/2006/bibliography"/>
   </ds:schemaRefs>
 </ds:datastoreItem>
-</file>
-
-<file path=customXml/itemProps4.xml><?xml version="1.0" encoding="utf-8"?>
-<ds:datastoreItem xmlns:ds="http://schemas.openxmlformats.org/officeDocument/2006/customXml" ds:itemID="{28F0E795-F19A-46E6-9516-D73D5998FE67}"/>
 </file>
</xml_diff>